<commit_message>
rough draft of interim report
</commit_message>
<xml_diff>
--- a/termpaper/DiPietrantonio_ME5311_TermPaper_Abstract.docx
+++ b/termpaper/DiPietrantonio_ME5311_TermPaper_Abstract.docx
@@ -6,6 +6,7 @@
       <w:pPr>
         <w:pStyle w:val="NoSpacing"/>
       </w:pPr>
+      <w:bookmarkStart w:id="0" w:name="_Hlk223474265"/>
       <w:r>
         <w:t>Christian DiPietrantonio</w:t>
       </w:r>
@@ -66,17 +67,15 @@
     </w:p>
     <w:p>
       <w:pPr>
-        <w:pStyle w:val="Heading1"/>
-      </w:pPr>
-      <w:r>
-        <w:t>topic description</w:t>
-      </w:r>
-    </w:p>
-    <w:p>
-      <w:pPr>
         <w:pStyle w:val="NoSpacing"/>
         <w:ind w:firstLine="360"/>
       </w:pPr>
+    </w:p>
+    <w:p>
+      <w:pPr>
+        <w:pStyle w:val="NoSpacing"/>
+        <w:ind w:firstLine="360"/>
+      </w:pPr>
       <w:r>
         <w:t xml:space="preserve">This </w:t>
       </w:r>
@@ -89,6 +88,14 @@
       <w:r>
         <w:t xml:space="preserve"> and the transported probability density function method used in computational fluid dynamics. </w:t>
       </w:r>
+      <w:proofErr w:type="gramStart"/>
+      <w:r>
+        <w:t>In order to</w:t>
+      </w:r>
+      <w:proofErr w:type="gramEnd"/>
+      <w:r>
+        <w:t xml:space="preserve"> make this comparison, foundational knowledge of the Black-Scholes-Merton equation must be presented.</w:t>
+      </w:r>
     </w:p>
     <w:p>
       <w:pPr>
@@ -102,13 +109,7 @@
         <w:t>.”</w:t>
       </w:r>
       <w:r>
-        <w:t xml:space="preserve"> The two major types of options are known as “American options” and </w:t>
-      </w:r>
-      <w:r>
-        <w:t>“European option</w:t>
-      </w:r>
-      <w:r>
-        <w:t>s</w:t>
+        <w:t xml:space="preserve"> The two major types of options are known as “American options” and “European options</w:t>
       </w:r>
       <w:r>
         <w:t>.”</w:t>
@@ -168,13 +169,7 @@
         <w:t xml:space="preserve"> of Black and Scholes [1] and </w:t>
       </w:r>
       <w:r>
-        <w:t xml:space="preserve">the formalization of continuous-time arbitrage </w:t>
-      </w:r>
-      <w:r>
-        <w:t xml:space="preserve">framework </w:t>
-      </w:r>
-      <w:r>
-        <w:t xml:space="preserve">developed by </w:t>
+        <w:t xml:space="preserve">the formalization of continuous-time arbitrage framework developed by </w:t>
       </w:r>
       <w:r>
         <w:t>Merton [2]</w:t>
@@ -183,13 +178,7 @@
         <w:t xml:space="preserve"> lead to the derivation of the </w:t>
       </w:r>
       <w:r>
-        <w:t xml:space="preserve">following second-order linear </w:t>
-      </w:r>
-      <w:r>
-        <w:t xml:space="preserve">parabolic </w:t>
-      </w:r>
-      <w:r>
-        <w:t xml:space="preserve">partial differential equation </w:t>
+        <w:t xml:space="preserve">following second-order linear parabolic partial differential equation </w:t>
       </w:r>
       <w:r>
         <w:t xml:space="preserve">for the price </w:t>
@@ -234,126 +223,75 @@
       </w:pPr>
       <m:oMathPara>
         <m:oMath>
-          <m:f>
-            <m:fPr>
+          <m:eqArr>
+            <m:eqArrPr>
+              <m:maxDist m:val="1"/>
               <m:ctrlPr>
                 <w:rPr>
                   <w:rFonts w:ascii="Cambria Math" w:eastAsiaTheme="minorEastAsia" w:hAnsi="Cambria Math"/>
                   <w:i/>
                 </w:rPr>
               </m:ctrlPr>
-            </m:fPr>
-            <m:num>
+            </m:eqArrPr>
+            <m:e>
+              <m:f>
+                <m:fPr>
+                  <m:ctrlPr>
+                    <w:rPr>
+                      <w:rFonts w:ascii="Cambria Math" w:eastAsiaTheme="minorEastAsia" w:hAnsi="Cambria Math"/>
+                      <w:i/>
+                    </w:rPr>
+                  </m:ctrlPr>
+                </m:fPr>
+                <m:num>
+                  <m:r>
+                    <w:rPr>
+                      <w:rFonts w:ascii="Cambria Math" w:eastAsiaTheme="minorEastAsia" w:hAnsi="Cambria Math"/>
+                    </w:rPr>
+                    <m:t>∂V</m:t>
+                  </m:r>
+                </m:num>
+                <m:den>
+                  <m:r>
+                    <w:rPr>
+                      <w:rFonts w:ascii="Cambria Math" w:eastAsiaTheme="minorEastAsia" w:hAnsi="Cambria Math"/>
+                    </w:rPr>
+                    <m:t>∂t</m:t>
+                  </m:r>
+                </m:den>
+              </m:f>
               <m:r>
                 <w:rPr>
                   <w:rFonts w:ascii="Cambria Math" w:eastAsiaTheme="minorEastAsia" w:hAnsi="Cambria Math"/>
                 </w:rPr>
-                <m:t>∂V</m:t>
+                <m:t>+</m:t>
               </m:r>
-            </m:num>
-            <m:den>
-              <m:r>
-                <w:rPr>
-                  <w:rFonts w:ascii="Cambria Math" w:eastAsiaTheme="minorEastAsia" w:hAnsi="Cambria Math"/>
-                </w:rPr>
-                <m:t>∂t</m:t>
-              </m:r>
-            </m:den>
-          </m:f>
-          <m:r>
-            <w:rPr>
-              <w:rFonts w:ascii="Cambria Math" w:eastAsiaTheme="minorEastAsia" w:hAnsi="Cambria Math"/>
-            </w:rPr>
-            <m:t>+</m:t>
-          </m:r>
-          <m:f>
-            <m:fPr>
-              <m:ctrlPr>
-                <w:rPr>
-                  <w:rFonts w:ascii="Cambria Math" w:eastAsiaTheme="minorEastAsia" w:hAnsi="Cambria Math"/>
-                  <w:i/>
-                </w:rPr>
-              </m:ctrlPr>
-            </m:fPr>
-            <m:num>
-              <m:r>
-                <w:rPr>
-                  <w:rFonts w:ascii="Cambria Math" w:eastAsiaTheme="minorEastAsia" w:hAnsi="Cambria Math"/>
-                </w:rPr>
-                <m:t>1</m:t>
-              </m:r>
-            </m:num>
-            <m:den>
-              <m:r>
-                <w:rPr>
-                  <w:rFonts w:ascii="Cambria Math" w:eastAsiaTheme="minorEastAsia" w:hAnsi="Cambria Math"/>
-                </w:rPr>
-                <m:t>2</m:t>
-              </m:r>
-            </m:den>
-          </m:f>
-          <m:sSup>
-            <m:sSupPr>
-              <m:ctrlPr>
-                <w:rPr>
-                  <w:rFonts w:ascii="Cambria Math" w:eastAsiaTheme="minorEastAsia" w:hAnsi="Cambria Math"/>
-                  <w:i/>
-                </w:rPr>
-              </m:ctrlPr>
-            </m:sSupPr>
-            <m:e>
-              <m:r>
-                <w:rPr>
-                  <w:rFonts w:ascii="Cambria Math" w:eastAsiaTheme="minorEastAsia" w:hAnsi="Cambria Math"/>
-                </w:rPr>
-                <m:t>σ</m:t>
-              </m:r>
-            </m:e>
-            <m:sup>
-              <m:r>
-                <w:rPr>
-                  <w:rFonts w:ascii="Cambria Math" w:eastAsiaTheme="minorEastAsia" w:hAnsi="Cambria Math"/>
-                </w:rPr>
-                <m:t>2</m:t>
-              </m:r>
-            </m:sup>
-          </m:sSup>
-          <m:sSup>
-            <m:sSupPr>
-              <m:ctrlPr>
-                <w:rPr>
-                  <w:rFonts w:ascii="Cambria Math" w:eastAsiaTheme="minorEastAsia" w:hAnsi="Cambria Math"/>
-                  <w:i/>
-                </w:rPr>
-              </m:ctrlPr>
-            </m:sSupPr>
-            <m:e>
-              <m:r>
-                <w:rPr>
-                  <w:rFonts w:ascii="Cambria Math" w:eastAsiaTheme="minorEastAsia" w:hAnsi="Cambria Math"/>
-                </w:rPr>
-                <m:t>S</m:t>
-              </m:r>
-            </m:e>
-            <m:sup>
-              <m:r>
-                <w:rPr>
-                  <w:rFonts w:ascii="Cambria Math" w:eastAsiaTheme="minorEastAsia" w:hAnsi="Cambria Math"/>
-                </w:rPr>
-                <m:t>2</m:t>
-              </m:r>
-            </m:sup>
-          </m:sSup>
-          <m:f>
-            <m:fPr>
-              <m:ctrlPr>
-                <w:rPr>
-                  <w:rFonts w:ascii="Cambria Math" w:eastAsiaTheme="minorEastAsia" w:hAnsi="Cambria Math"/>
-                  <w:i/>
-                </w:rPr>
-              </m:ctrlPr>
-            </m:fPr>
-            <m:num>
+              <m:f>
+                <m:fPr>
+                  <m:ctrlPr>
+                    <w:rPr>
+                      <w:rFonts w:ascii="Cambria Math" w:eastAsiaTheme="minorEastAsia" w:hAnsi="Cambria Math"/>
+                      <w:i/>
+                    </w:rPr>
+                  </m:ctrlPr>
+                </m:fPr>
+                <m:num>
+                  <m:r>
+                    <w:rPr>
+                      <w:rFonts w:ascii="Cambria Math" w:eastAsiaTheme="minorEastAsia" w:hAnsi="Cambria Math"/>
+                    </w:rPr>
+                    <m:t>1</m:t>
+                  </m:r>
+                </m:num>
+                <m:den>
+                  <m:r>
+                    <w:rPr>
+                      <w:rFonts w:ascii="Cambria Math" w:eastAsiaTheme="minorEastAsia" w:hAnsi="Cambria Math"/>
+                    </w:rPr>
+                    <m:t>2</m:t>
+                  </m:r>
+                </m:den>
+              </m:f>
               <m:sSup>
                 <m:sSupPr>
                   <m:ctrlPr>
@@ -368,7 +306,7 @@
                     <w:rPr>
                       <w:rFonts w:ascii="Cambria Math" w:eastAsiaTheme="minorEastAsia" w:hAnsi="Cambria Math"/>
                     </w:rPr>
-                    <m:t>∂</m:t>
+                    <m:t>σ</m:t>
                   </m:r>
                 </m:e>
                 <m:sup>
@@ -380,20 +318,6 @@
                   </m:r>
                 </m:sup>
               </m:sSup>
-              <m:r>
-                <w:rPr>
-                  <w:rFonts w:ascii="Cambria Math" w:eastAsiaTheme="minorEastAsia" w:hAnsi="Cambria Math"/>
-                </w:rPr>
-                <m:t>V</m:t>
-              </m:r>
-            </m:num>
-            <m:den>
-              <m:r>
-                <w:rPr>
-                  <w:rFonts w:ascii="Cambria Math" w:eastAsiaTheme="minorEastAsia" w:hAnsi="Cambria Math"/>
-                </w:rPr>
-                <m:t>∂</m:t>
-              </m:r>
               <m:sSup>
                 <m:sSupPr>
                   <m:ctrlPr>
@@ -420,46 +344,124 @@
                   </m:r>
                 </m:sup>
               </m:sSup>
-            </m:den>
-          </m:f>
-          <m:r>
-            <w:rPr>
-              <w:rFonts w:ascii="Cambria Math" w:eastAsiaTheme="minorEastAsia" w:hAnsi="Cambria Math"/>
-            </w:rPr>
-            <m:t>+rS</m:t>
-          </m:r>
-          <m:f>
-            <m:fPr>
-              <m:ctrlPr>
-                <w:rPr>
-                  <w:rFonts w:ascii="Cambria Math" w:eastAsiaTheme="minorEastAsia" w:hAnsi="Cambria Math"/>
-                  <w:i/>
-                </w:rPr>
-              </m:ctrlPr>
-            </m:fPr>
-            <m:num>
+              <m:f>
+                <m:fPr>
+                  <m:ctrlPr>
+                    <w:rPr>
+                      <w:rFonts w:ascii="Cambria Math" w:eastAsiaTheme="minorEastAsia" w:hAnsi="Cambria Math"/>
+                      <w:i/>
+                    </w:rPr>
+                  </m:ctrlPr>
+                </m:fPr>
+                <m:num>
+                  <m:sSup>
+                    <m:sSupPr>
+                      <m:ctrlPr>
+                        <w:rPr>
+                          <w:rFonts w:ascii="Cambria Math" w:eastAsiaTheme="minorEastAsia" w:hAnsi="Cambria Math"/>
+                          <w:i/>
+                        </w:rPr>
+                      </m:ctrlPr>
+                    </m:sSupPr>
+                    <m:e>
+                      <m:r>
+                        <w:rPr>
+                          <w:rFonts w:ascii="Cambria Math" w:eastAsiaTheme="minorEastAsia" w:hAnsi="Cambria Math"/>
+                        </w:rPr>
+                        <m:t>∂</m:t>
+                      </m:r>
+                    </m:e>
+                    <m:sup>
+                      <m:r>
+                        <w:rPr>
+                          <w:rFonts w:ascii="Cambria Math" w:eastAsiaTheme="minorEastAsia" w:hAnsi="Cambria Math"/>
+                        </w:rPr>
+                        <m:t>2</m:t>
+                      </m:r>
+                    </m:sup>
+                  </m:sSup>
+                  <m:r>
+                    <w:rPr>
+                      <w:rFonts w:ascii="Cambria Math" w:eastAsiaTheme="minorEastAsia" w:hAnsi="Cambria Math"/>
+                    </w:rPr>
+                    <m:t>V</m:t>
+                  </m:r>
+                </m:num>
+                <m:den>
+                  <m:r>
+                    <w:rPr>
+                      <w:rFonts w:ascii="Cambria Math" w:eastAsiaTheme="minorEastAsia" w:hAnsi="Cambria Math"/>
+                    </w:rPr>
+                    <m:t>∂</m:t>
+                  </m:r>
+                  <m:sSup>
+                    <m:sSupPr>
+                      <m:ctrlPr>
+                        <w:rPr>
+                          <w:rFonts w:ascii="Cambria Math" w:eastAsiaTheme="minorEastAsia" w:hAnsi="Cambria Math"/>
+                          <w:i/>
+                        </w:rPr>
+                      </m:ctrlPr>
+                    </m:sSupPr>
+                    <m:e>
+                      <m:r>
+                        <w:rPr>
+                          <w:rFonts w:ascii="Cambria Math" w:eastAsiaTheme="minorEastAsia" w:hAnsi="Cambria Math"/>
+                        </w:rPr>
+                        <m:t>S</m:t>
+                      </m:r>
+                    </m:e>
+                    <m:sup>
+                      <m:r>
+                        <w:rPr>
+                          <w:rFonts w:ascii="Cambria Math" w:eastAsiaTheme="minorEastAsia" w:hAnsi="Cambria Math"/>
+                        </w:rPr>
+                        <m:t>2</m:t>
+                      </m:r>
+                    </m:sup>
+                  </m:sSup>
+                </m:den>
+              </m:f>
               <m:r>
                 <w:rPr>
                   <w:rFonts w:ascii="Cambria Math" w:eastAsiaTheme="minorEastAsia" w:hAnsi="Cambria Math"/>
                 </w:rPr>
-                <m:t>∂V</m:t>
+                <m:t>+rS</m:t>
               </m:r>
-            </m:num>
-            <m:den>
+              <m:f>
+                <m:fPr>
+                  <m:ctrlPr>
+                    <w:rPr>
+                      <w:rFonts w:ascii="Cambria Math" w:eastAsiaTheme="minorEastAsia" w:hAnsi="Cambria Math"/>
+                      <w:i/>
+                    </w:rPr>
+                  </m:ctrlPr>
+                </m:fPr>
+                <m:num>
+                  <m:r>
+                    <w:rPr>
+                      <w:rFonts w:ascii="Cambria Math" w:eastAsiaTheme="minorEastAsia" w:hAnsi="Cambria Math"/>
+                    </w:rPr>
+                    <m:t>∂V</m:t>
+                  </m:r>
+                </m:num>
+                <m:den>
+                  <m:r>
+                    <w:rPr>
+                      <w:rFonts w:ascii="Cambria Math" w:eastAsiaTheme="minorEastAsia" w:hAnsi="Cambria Math"/>
+                    </w:rPr>
+                    <m:t>∂S</m:t>
+                  </m:r>
+                </m:den>
+              </m:f>
               <m:r>
                 <w:rPr>
                   <w:rFonts w:ascii="Cambria Math" w:eastAsiaTheme="minorEastAsia" w:hAnsi="Cambria Math"/>
                 </w:rPr>
-                <m:t>∂S</m:t>
+                <m:t>-rV=0#1</m:t>
               </m:r>
-            </m:den>
-          </m:f>
-          <m:r>
-            <w:rPr>
-              <w:rFonts w:ascii="Cambria Math" w:eastAsiaTheme="minorEastAsia" w:hAnsi="Cambria Math"/>
-            </w:rPr>
-            <m:t>-rV=0</m:t>
-          </m:r>
+            </m:e>
+          </m:eqArr>
         </m:oMath>
       </m:oMathPara>
     </w:p>
@@ -627,6 +629,2264 @@
       <w:pPr>
         <w:pStyle w:val="NoSpacing"/>
       </w:pPr>
+      <w:r>
+        <w:tab/>
+        <w:t xml:space="preserve">Again, </w:t>
+      </w:r>
+      <w:proofErr w:type="gramStart"/>
+      <w:r>
+        <w:t>in order to</w:t>
+      </w:r>
+      <w:proofErr w:type="gramEnd"/>
+      <w:r>
+        <w:t xml:space="preserve"> advance to the mathematical connection between the </w:t>
+      </w:r>
+      <w:r>
+        <w:t>Black-Scholes-Merton equation for financial derivative pricing and the transported probability density function method</w:t>
+      </w:r>
+      <w:r>
+        <w:t xml:space="preserve">, a basic understanding of the transported probability density function </w:t>
+      </w:r>
+      <w:r>
+        <w:t>must</w:t>
+      </w:r>
+      <w:r>
+        <w:t xml:space="preserve"> be obtained. For high Reynolds number flows, a statistical approach can be used to solve for the properties of the flow.</w:t>
+      </w:r>
+      <w:r>
+        <w:t xml:space="preserve"> In </w:t>
+      </w:r>
+      <w:r>
+        <w:rPr>
+          <w:i/>
+          <w:iCs/>
+        </w:rPr>
+        <w:t>Turbulent Flows</w:t>
+      </w:r>
+      <w:r>
+        <w:t xml:space="preserve">, </w:t>
+      </w:r>
+      <w:r>
+        <w:t>Stephen B. Pope</w:t>
+      </w:r>
+      <w:r>
+        <w:t xml:space="preserve"> remarks that</w:t>
+      </w:r>
+      <w:r>
+        <w:t xml:space="preserve"> “in a turbulent flow, the velocity field</w:t>
+      </w:r>
+      <w:r>
+        <w:t xml:space="preserve"> </w:t>
+      </w:r>
+      <m:oMath>
+        <m:r>
+          <w:rPr>
+            <w:rFonts w:ascii="Cambria Math" w:hAnsi="Cambria Math"/>
+          </w:rPr>
+          <m:t>U(x, t)</m:t>
+        </m:r>
+      </m:oMath>
+      <w:r>
+        <w:t xml:space="preserve"> is random.”</w:t>
+      </w:r>
+      <w:r>
+        <w:t xml:space="preserve"> [3]</w:t>
+      </w:r>
+      <w:r>
+        <w:t xml:space="preserve"> What this means, is that if one were to repeat the same experiment multiple times under the same set of conditions, a given event may, but need not occur, making it inherently unpredictable. Although a random variable, such as velocity can not be predicted, the probability of events (e.g. the velocity is less than 10 m/s) can be used to create a </w:t>
+      </w:r>
+      <w:r>
+        <w:t>P</w:t>
+      </w:r>
+      <w:r>
+        <w:t xml:space="preserve">robability </w:t>
+      </w:r>
+      <w:r>
+        <w:t>D</w:t>
+      </w:r>
+      <w:r>
+        <w:t xml:space="preserve">ensity </w:t>
+      </w:r>
+      <w:r>
+        <w:t>F</w:t>
+      </w:r>
+      <w:r>
+        <w:t xml:space="preserve">unction </w:t>
+      </w:r>
+      <w:r>
+        <w:lastRenderedPageBreak/>
+        <w:t xml:space="preserve">(PDF) that characterizes the random variable. Formally, the probability of any event can be </w:t>
+      </w:r>
+      <w:r>
+        <w:t>determined</w:t>
+      </w:r>
+      <w:r>
+        <w:t xml:space="preserve"> </w:t>
+      </w:r>
+      <w:r>
+        <w:t>by the Cumulative Distribution Function, and the PDF is defined to be the derivative of the CDF.</w:t>
+      </w:r>
+      <w:r>
+        <w:t xml:space="preserve"> The evolution of this </w:t>
+      </w:r>
+      <w:r>
+        <w:t xml:space="preserve">Eulerian </w:t>
+      </w:r>
+      <w:r>
+        <w:t>PDF</w:t>
+      </w:r>
+      <w:r>
+        <w:t xml:space="preserve"> of velocity</w:t>
+      </w:r>
+      <w:r>
+        <w:t xml:space="preserve"> in space and time can be represented by a transport equation derived by Pope from the Navier-Stokes equations</w:t>
+      </w:r>
+      <w:r>
+        <w:t>. The result is the following Eulerian PDF transport equation:</w:t>
+      </w:r>
+    </w:p>
+    <w:p>
+      <w:pPr>
+        <w:pStyle w:val="NoSpacing"/>
+        <w:rPr>
+          <w:rFonts w:eastAsiaTheme="minorEastAsia"/>
+        </w:rPr>
+      </w:pPr>
+      <m:oMathPara>
+        <m:oMath>
+          <m:eqArr>
+            <m:eqArrPr>
+              <m:maxDist m:val="1"/>
+              <m:ctrlPr>
+                <w:rPr>
+                  <w:rFonts w:ascii="Cambria Math" w:hAnsi="Cambria Math"/>
+                  <w:i/>
+                </w:rPr>
+              </m:ctrlPr>
+            </m:eqArrPr>
+            <m:e>
+              <m:f>
+                <m:fPr>
+                  <m:ctrlPr>
+                    <w:rPr>
+                      <w:rFonts w:ascii="Cambria Math" w:hAnsi="Cambria Math"/>
+                      <w:i/>
+                    </w:rPr>
+                  </m:ctrlPr>
+                </m:fPr>
+                <m:num>
+                  <m:r>
+                    <w:rPr>
+                      <w:rFonts w:ascii="Cambria Math" w:hAnsi="Cambria Math"/>
+                    </w:rPr>
+                    <m:t>∂f</m:t>
+                  </m:r>
+                </m:num>
+                <m:den>
+                  <m:r>
+                    <w:rPr>
+                      <w:rFonts w:ascii="Cambria Math" w:hAnsi="Cambria Math"/>
+                    </w:rPr>
+                    <m:t>∂t</m:t>
+                  </m:r>
+                </m:den>
+              </m:f>
+              <m:r>
+                <w:rPr>
+                  <w:rFonts w:ascii="Cambria Math" w:hAnsi="Cambria Math"/>
+                </w:rPr>
+                <m:t>+</m:t>
+              </m:r>
+              <m:sSub>
+                <m:sSubPr>
+                  <m:ctrlPr>
+                    <w:rPr>
+                      <w:rFonts w:ascii="Cambria Math" w:hAnsi="Cambria Math"/>
+                      <w:i/>
+                    </w:rPr>
+                  </m:ctrlPr>
+                </m:sSubPr>
+                <m:e>
+                  <m:r>
+                    <w:rPr>
+                      <w:rFonts w:ascii="Cambria Math" w:hAnsi="Cambria Math"/>
+                    </w:rPr>
+                    <m:t>V</m:t>
+                  </m:r>
+                </m:e>
+                <m:sub>
+                  <m:r>
+                    <w:rPr>
+                      <w:rFonts w:ascii="Cambria Math" w:hAnsi="Cambria Math"/>
+                    </w:rPr>
+                    <m:t>i</m:t>
+                  </m:r>
+                </m:sub>
+              </m:sSub>
+              <m:f>
+                <m:fPr>
+                  <m:ctrlPr>
+                    <w:rPr>
+                      <w:rFonts w:ascii="Cambria Math" w:hAnsi="Cambria Math"/>
+                      <w:i/>
+                    </w:rPr>
+                  </m:ctrlPr>
+                </m:fPr>
+                <m:num>
+                  <m:r>
+                    <w:rPr>
+                      <w:rFonts w:ascii="Cambria Math" w:hAnsi="Cambria Math"/>
+                    </w:rPr>
+                    <m:t>∂f</m:t>
+                  </m:r>
+                </m:num>
+                <m:den>
+                  <m:r>
+                    <w:rPr>
+                      <w:rFonts w:ascii="Cambria Math" w:hAnsi="Cambria Math"/>
+                    </w:rPr>
+                    <m:t>∂</m:t>
+                  </m:r>
+                  <m:sSub>
+                    <m:sSubPr>
+                      <m:ctrlPr>
+                        <w:rPr>
+                          <w:rFonts w:ascii="Cambria Math" w:hAnsi="Cambria Math"/>
+                          <w:i/>
+                        </w:rPr>
+                      </m:ctrlPr>
+                    </m:sSubPr>
+                    <m:e>
+                      <m:r>
+                        <w:rPr>
+                          <w:rFonts w:ascii="Cambria Math" w:hAnsi="Cambria Math"/>
+                        </w:rPr>
+                        <m:t>x</m:t>
+                      </m:r>
+                    </m:e>
+                    <m:sub>
+                      <m:r>
+                        <w:rPr>
+                          <w:rFonts w:ascii="Cambria Math" w:hAnsi="Cambria Math"/>
+                        </w:rPr>
+                        <m:t>i</m:t>
+                      </m:r>
+                    </m:sub>
+                  </m:sSub>
+                </m:den>
+              </m:f>
+              <m:r>
+                <w:rPr>
+                  <w:rFonts w:ascii="Cambria Math" w:hAnsi="Cambria Math"/>
+                </w:rPr>
+                <m:t xml:space="preserve">= - </m:t>
+              </m:r>
+              <m:f>
+                <m:fPr>
+                  <m:ctrlPr>
+                    <w:rPr>
+                      <w:rFonts w:ascii="Cambria Math" w:hAnsi="Cambria Math"/>
+                      <w:i/>
+                    </w:rPr>
+                  </m:ctrlPr>
+                </m:fPr>
+                <m:num>
+                  <m:r>
+                    <w:rPr>
+                      <w:rFonts w:ascii="Cambria Math" w:hAnsi="Cambria Math"/>
+                    </w:rPr>
+                    <m:t>∂</m:t>
+                  </m:r>
+                </m:num>
+                <m:den>
+                  <m:r>
+                    <w:rPr>
+                      <w:rFonts w:ascii="Cambria Math" w:hAnsi="Cambria Math"/>
+                    </w:rPr>
+                    <m:t>∂</m:t>
+                  </m:r>
+                  <m:sSub>
+                    <m:sSubPr>
+                      <m:ctrlPr>
+                        <w:rPr>
+                          <w:rFonts w:ascii="Cambria Math" w:hAnsi="Cambria Math"/>
+                          <w:i/>
+                        </w:rPr>
+                      </m:ctrlPr>
+                    </m:sSubPr>
+                    <m:e>
+                      <m:r>
+                        <w:rPr>
+                          <w:rFonts w:ascii="Cambria Math" w:hAnsi="Cambria Math"/>
+                        </w:rPr>
+                        <m:t>V</m:t>
+                      </m:r>
+                    </m:e>
+                    <m:sub>
+                      <m:r>
+                        <w:rPr>
+                          <w:rFonts w:ascii="Cambria Math" w:hAnsi="Cambria Math"/>
+                        </w:rPr>
+                        <m:t>i</m:t>
+                      </m:r>
+                    </m:sub>
+                  </m:sSub>
+                </m:den>
+              </m:f>
+              <m:d>
+                <m:dPr>
+                  <m:begChr m:val="["/>
+                  <m:endChr m:val="]"/>
+                  <m:ctrlPr>
+                    <w:rPr>
+                      <w:rFonts w:ascii="Cambria Math" w:hAnsi="Cambria Math"/>
+                      <w:i/>
+                    </w:rPr>
+                  </m:ctrlPr>
+                </m:dPr>
+                <m:e>
+                  <m:r>
+                    <w:rPr>
+                      <w:rFonts w:ascii="Cambria Math" w:hAnsi="Cambria Math"/>
+                    </w:rPr>
+                    <m:t>f&lt;</m:t>
+                  </m:r>
+                  <m:f>
+                    <m:fPr>
+                      <m:ctrlPr>
+                        <w:rPr>
+                          <w:rFonts w:ascii="Cambria Math" w:hAnsi="Cambria Math"/>
+                          <w:i/>
+                        </w:rPr>
+                      </m:ctrlPr>
+                    </m:fPr>
+                    <m:num>
+                      <m:r>
+                        <w:rPr>
+                          <w:rFonts w:ascii="Cambria Math" w:hAnsi="Cambria Math"/>
+                        </w:rPr>
+                        <m:t>D</m:t>
+                      </m:r>
+                      <m:sSub>
+                        <m:sSubPr>
+                          <m:ctrlPr>
+                            <w:rPr>
+                              <w:rFonts w:ascii="Cambria Math" w:hAnsi="Cambria Math"/>
+                              <w:i/>
+                            </w:rPr>
+                          </m:ctrlPr>
+                        </m:sSubPr>
+                        <m:e>
+                          <m:r>
+                            <w:rPr>
+                              <w:rFonts w:ascii="Cambria Math" w:hAnsi="Cambria Math"/>
+                            </w:rPr>
+                            <m:t>U</m:t>
+                          </m:r>
+                        </m:e>
+                        <m:sub>
+                          <m:r>
+                            <w:rPr>
+                              <w:rFonts w:ascii="Cambria Math" w:hAnsi="Cambria Math"/>
+                            </w:rPr>
+                            <m:t>t</m:t>
+                          </m:r>
+                        </m:sub>
+                      </m:sSub>
+                    </m:num>
+                    <m:den>
+                      <m:r>
+                        <w:rPr>
+                          <w:rFonts w:ascii="Cambria Math" w:hAnsi="Cambria Math"/>
+                        </w:rPr>
+                        <m:t>Dt</m:t>
+                      </m:r>
+                    </m:den>
+                  </m:f>
+                </m:e>
+                <m:e>
+                  <m:r>
+                    <m:rPr>
+                      <m:sty m:val="bi"/>
+                    </m:rPr>
+                    <w:rPr>
+                      <w:rFonts w:ascii="Cambria Math" w:hAnsi="Cambria Math"/>
+                    </w:rPr>
+                    <m:t>V&gt;</m:t>
+                  </m:r>
+                  <m:ctrlPr>
+                    <w:rPr>
+                      <w:rFonts w:ascii="Cambria Math" w:hAnsi="Cambria Math"/>
+                      <w:b/>
+                      <w:bCs/>
+                      <w:i/>
+                    </w:rPr>
+                  </m:ctrlPr>
+                </m:e>
+              </m:d>
+              <m:r>
+                <w:rPr>
+                  <w:rFonts w:ascii="Cambria Math" w:hAnsi="Cambria Math"/>
+                </w:rPr>
+                <m:t>#2</m:t>
+              </m:r>
+            </m:e>
+          </m:eqArr>
+          <m:r>
+            <w:br/>
+          </m:r>
+        </m:oMath>
+      </m:oMathPara>
+      <w:r>
+        <w:t xml:space="preserve">Where </w:t>
+      </w:r>
+      <m:oMath>
+        <m:r>
+          <w:rPr>
+            <w:rFonts w:ascii="Cambria Math" w:hAnsi="Cambria Math"/>
+          </w:rPr>
+          <m:t>f(</m:t>
+        </m:r>
+        <m:r>
+          <m:rPr>
+            <m:sty m:val="bi"/>
+          </m:rPr>
+          <w:rPr>
+            <w:rFonts w:ascii="Cambria Math" w:hAnsi="Cambria Math"/>
+          </w:rPr>
+          <m:t>V;</m:t>
+        </m:r>
+        <m:r>
+          <m:rPr>
+            <m:sty m:val="bi"/>
+          </m:rPr>
+          <w:rPr>
+            <w:rFonts w:ascii="Cambria Math" w:hAnsi="Cambria Math"/>
+          </w:rPr>
+          <m:t>x</m:t>
+        </m:r>
+        <m:r>
+          <w:rPr>
+            <w:rFonts w:ascii="Cambria Math" w:hAnsi="Cambria Math"/>
+          </w:rPr>
+          <m:t>,t)</m:t>
+        </m:r>
+      </m:oMath>
+      <w:r>
+        <w:rPr>
+          <w:rFonts w:eastAsiaTheme="minorEastAsia"/>
+        </w:rPr>
+        <w:t xml:space="preserve"> is the Eulerian PDF of velocity</w:t>
+      </w:r>
+      <w:r>
+        <w:rPr>
+          <w:rFonts w:eastAsiaTheme="minorEastAsia"/>
+        </w:rPr>
+        <w:t>.</w:t>
+      </w:r>
+      <w:r>
+        <w:t xml:space="preserve"> </w:t>
+      </w:r>
+      <w:r>
+        <w:t>Equivalently, the Lagrangian PDF transport equation, or in other words, the equation for the evolution of the conditional PDF of the particle velocity is expressed as:</w:t>
+      </w:r>
+    </w:p>
+    <w:p>
+      <w:pPr>
+        <w:pStyle w:val="NoSpacing"/>
+        <w:rPr>
+          <w:rFonts w:eastAsiaTheme="minorEastAsia"/>
+        </w:rPr>
+      </w:pPr>
+      <m:oMathPara>
+        <m:oMath>
+          <m:eqArr>
+            <m:eqArrPr>
+              <m:maxDist m:val="1"/>
+              <m:ctrlPr>
+                <w:rPr>
+                  <w:rFonts w:ascii="Cambria Math" w:hAnsi="Cambria Math"/>
+                  <w:i/>
+                </w:rPr>
+              </m:ctrlPr>
+            </m:eqArrPr>
+            <m:e>
+              <m:f>
+                <m:fPr>
+                  <m:ctrlPr>
+                    <w:rPr>
+                      <w:rFonts w:ascii="Cambria Math" w:hAnsi="Cambria Math"/>
+                      <w:i/>
+                    </w:rPr>
+                  </m:ctrlPr>
+                </m:fPr>
+                <m:num>
+                  <m:r>
+                    <w:rPr>
+                      <w:rFonts w:ascii="Cambria Math" w:hAnsi="Cambria Math"/>
+                    </w:rPr>
+                    <m:t>∂</m:t>
+                  </m:r>
+                  <m:sSup>
+                    <m:sSupPr>
+                      <m:ctrlPr>
+                        <w:rPr>
+                          <w:rFonts w:ascii="Cambria Math" w:hAnsi="Cambria Math"/>
+                          <w:i/>
+                        </w:rPr>
+                      </m:ctrlPr>
+                    </m:sSupPr>
+                    <m:e>
+                      <m:r>
+                        <w:rPr>
+                          <w:rFonts w:ascii="Cambria Math" w:hAnsi="Cambria Math"/>
+                        </w:rPr>
+                        <m:t>f</m:t>
+                      </m:r>
+                    </m:e>
+                    <m:sup>
+                      <m:r>
+                        <w:rPr>
+                          <w:rFonts w:ascii="Cambria Math" w:hAnsi="Cambria Math"/>
+                        </w:rPr>
+                        <m:t>*</m:t>
+                      </m:r>
+                    </m:sup>
+                  </m:sSup>
+                </m:num>
+                <m:den>
+                  <m:r>
+                    <w:rPr>
+                      <w:rFonts w:ascii="Cambria Math" w:hAnsi="Cambria Math"/>
+                    </w:rPr>
+                    <m:t>dt</m:t>
+                  </m:r>
+                </m:den>
+              </m:f>
+              <m:r>
+                <w:rPr>
+                  <w:rFonts w:ascii="Cambria Math" w:hAnsi="Cambria Math"/>
+                </w:rPr>
+                <m:t>+</m:t>
+              </m:r>
+              <m:sSub>
+                <m:sSubPr>
+                  <m:ctrlPr>
+                    <w:rPr>
+                      <w:rFonts w:ascii="Cambria Math" w:hAnsi="Cambria Math"/>
+                      <w:i/>
+                    </w:rPr>
+                  </m:ctrlPr>
+                </m:sSubPr>
+                <m:e>
+                  <m:r>
+                    <w:rPr>
+                      <w:rFonts w:ascii="Cambria Math" w:hAnsi="Cambria Math"/>
+                    </w:rPr>
+                    <m:t>V</m:t>
+                  </m:r>
+                </m:e>
+                <m:sub>
+                  <m:r>
+                    <w:rPr>
+                      <w:rFonts w:ascii="Cambria Math" w:hAnsi="Cambria Math"/>
+                    </w:rPr>
+                    <m:t>i</m:t>
+                  </m:r>
+                </m:sub>
+              </m:sSub>
+              <m:f>
+                <m:fPr>
+                  <m:ctrlPr>
+                    <w:rPr>
+                      <w:rFonts w:ascii="Cambria Math" w:hAnsi="Cambria Math"/>
+                      <w:i/>
+                    </w:rPr>
+                  </m:ctrlPr>
+                </m:fPr>
+                <m:num>
+                  <m:r>
+                    <w:rPr>
+                      <w:rFonts w:ascii="Cambria Math" w:hAnsi="Cambria Math"/>
+                    </w:rPr>
+                    <m:t>∂</m:t>
+                  </m:r>
+                  <m:sSup>
+                    <m:sSupPr>
+                      <m:ctrlPr>
+                        <w:rPr>
+                          <w:rFonts w:ascii="Cambria Math" w:hAnsi="Cambria Math"/>
+                          <w:i/>
+                        </w:rPr>
+                      </m:ctrlPr>
+                    </m:sSupPr>
+                    <m:e>
+                      <m:r>
+                        <w:rPr>
+                          <w:rFonts w:ascii="Cambria Math" w:hAnsi="Cambria Math"/>
+                        </w:rPr>
+                        <m:t>f</m:t>
+                      </m:r>
+                    </m:e>
+                    <m:sup>
+                      <m:r>
+                        <w:rPr>
+                          <w:rFonts w:ascii="Cambria Math" w:hAnsi="Cambria Math"/>
+                        </w:rPr>
+                        <m:t>*</m:t>
+                      </m:r>
+                    </m:sup>
+                  </m:sSup>
+                </m:num>
+                <m:den>
+                  <m:r>
+                    <w:rPr>
+                      <w:rFonts w:ascii="Cambria Math" w:hAnsi="Cambria Math"/>
+                    </w:rPr>
+                    <m:t>∂</m:t>
+                  </m:r>
+                  <m:sSub>
+                    <m:sSubPr>
+                      <m:ctrlPr>
+                        <w:rPr>
+                          <w:rFonts w:ascii="Cambria Math" w:hAnsi="Cambria Math"/>
+                          <w:i/>
+                        </w:rPr>
+                      </m:ctrlPr>
+                    </m:sSubPr>
+                    <m:e>
+                      <m:r>
+                        <w:rPr>
+                          <w:rFonts w:ascii="Cambria Math" w:hAnsi="Cambria Math"/>
+                        </w:rPr>
+                        <m:t>x</m:t>
+                      </m:r>
+                    </m:e>
+                    <m:sub>
+                      <m:r>
+                        <w:rPr>
+                          <w:rFonts w:ascii="Cambria Math" w:hAnsi="Cambria Math"/>
+                        </w:rPr>
+                        <m:t>i</m:t>
+                      </m:r>
+                    </m:sub>
+                  </m:sSub>
+                </m:den>
+              </m:f>
+              <m:r>
+                <w:rPr>
+                  <w:rFonts w:ascii="Cambria Math" w:hAnsi="Cambria Math"/>
+                </w:rPr>
+                <m:t>=-</m:t>
+              </m:r>
+              <m:f>
+                <m:fPr>
+                  <m:ctrlPr>
+                    <w:rPr>
+                      <w:rFonts w:ascii="Cambria Math" w:hAnsi="Cambria Math"/>
+                      <w:i/>
+                    </w:rPr>
+                  </m:ctrlPr>
+                </m:fPr>
+                <m:num>
+                  <m:r>
+                    <w:rPr>
+                      <w:rFonts w:ascii="Cambria Math" w:hAnsi="Cambria Math"/>
+                    </w:rPr>
+                    <m:t>∂</m:t>
+                  </m:r>
+                </m:num>
+                <m:den>
+                  <m:r>
+                    <w:rPr>
+                      <w:rFonts w:ascii="Cambria Math" w:hAnsi="Cambria Math"/>
+                    </w:rPr>
+                    <m:t>∂</m:t>
+                  </m:r>
+                  <m:sSub>
+                    <m:sSubPr>
+                      <m:ctrlPr>
+                        <w:rPr>
+                          <w:rFonts w:ascii="Cambria Math" w:hAnsi="Cambria Math"/>
+                          <w:i/>
+                        </w:rPr>
+                      </m:ctrlPr>
+                    </m:sSubPr>
+                    <m:e>
+                      <m:r>
+                        <w:rPr>
+                          <w:rFonts w:ascii="Cambria Math" w:hAnsi="Cambria Math"/>
+                        </w:rPr>
+                        <m:t>V</m:t>
+                      </m:r>
+                    </m:e>
+                    <m:sub>
+                      <m:r>
+                        <w:rPr>
+                          <w:rFonts w:ascii="Cambria Math" w:hAnsi="Cambria Math"/>
+                        </w:rPr>
+                        <m:t>i</m:t>
+                      </m:r>
+                    </m:sub>
+                  </m:sSub>
+                </m:den>
+              </m:f>
+              <m:d>
+                <m:dPr>
+                  <m:begChr m:val="["/>
+                  <m:endChr m:val="]"/>
+                  <m:ctrlPr>
+                    <w:rPr>
+                      <w:rFonts w:ascii="Cambria Math" w:hAnsi="Cambria Math"/>
+                      <w:i/>
+                    </w:rPr>
+                  </m:ctrlPr>
+                </m:dPr>
+                <m:e>
+                  <m:sSup>
+                    <m:sSupPr>
+                      <m:ctrlPr>
+                        <w:rPr>
+                          <w:rFonts w:ascii="Cambria Math" w:hAnsi="Cambria Math"/>
+                          <w:i/>
+                        </w:rPr>
+                      </m:ctrlPr>
+                    </m:sSupPr>
+                    <m:e>
+                      <m:r>
+                        <w:rPr>
+                          <w:rFonts w:ascii="Cambria Math" w:hAnsi="Cambria Math"/>
+                        </w:rPr>
+                        <m:t>f</m:t>
+                      </m:r>
+                    </m:e>
+                    <m:sup>
+                      <m:r>
+                        <w:rPr>
+                          <w:rFonts w:ascii="Cambria Math" w:hAnsi="Cambria Math"/>
+                        </w:rPr>
+                        <m:t>*</m:t>
+                      </m:r>
+                    </m:sup>
+                  </m:sSup>
+                  <m:sSub>
+                    <m:sSubPr>
+                      <m:ctrlPr>
+                        <w:rPr>
+                          <w:rFonts w:ascii="Cambria Math" w:hAnsi="Cambria Math"/>
+                          <w:i/>
+                        </w:rPr>
+                      </m:ctrlPr>
+                    </m:sSubPr>
+                    <m:e>
+                      <m:r>
+                        <w:rPr>
+                          <w:rFonts w:ascii="Cambria Math" w:hAnsi="Cambria Math"/>
+                        </w:rPr>
+                        <m:t>a</m:t>
+                      </m:r>
+                    </m:e>
+                    <m:sub>
+                      <m:r>
+                        <w:rPr>
+                          <w:rFonts w:ascii="Cambria Math" w:hAnsi="Cambria Math"/>
+                        </w:rPr>
+                        <m:t>i</m:t>
+                      </m:r>
+                    </m:sub>
+                  </m:sSub>
+                  <m:d>
+                    <m:dPr>
+                      <m:ctrlPr>
+                        <w:rPr>
+                          <w:rFonts w:ascii="Cambria Math" w:hAnsi="Cambria Math"/>
+                          <w:i/>
+                        </w:rPr>
+                      </m:ctrlPr>
+                    </m:dPr>
+                    <m:e>
+                      <m:r>
+                        <m:rPr>
+                          <m:sty m:val="bi"/>
+                        </m:rPr>
+                        <w:rPr>
+                          <w:rFonts w:ascii="Cambria Math" w:hAnsi="Cambria Math"/>
+                        </w:rPr>
+                        <m:t>V, x</m:t>
+                      </m:r>
+                      <m:r>
+                        <w:rPr>
+                          <w:rFonts w:ascii="Cambria Math" w:hAnsi="Cambria Math"/>
+                        </w:rPr>
+                        <m:t>, t</m:t>
+                      </m:r>
+                    </m:e>
+                  </m:d>
+                </m:e>
+              </m:d>
+              <m:r>
+                <w:rPr>
+                  <w:rFonts w:ascii="Cambria Math" w:hAnsi="Cambria Math"/>
+                </w:rPr>
+                <m:t xml:space="preserve">+ </m:t>
+              </m:r>
+              <m:f>
+                <m:fPr>
+                  <m:ctrlPr>
+                    <w:rPr>
+                      <w:rFonts w:ascii="Cambria Math" w:hAnsi="Cambria Math"/>
+                      <w:i/>
+                    </w:rPr>
+                  </m:ctrlPr>
+                </m:fPr>
+                <m:num>
+                  <m:r>
+                    <w:rPr>
+                      <w:rFonts w:ascii="Cambria Math" w:hAnsi="Cambria Math"/>
+                    </w:rPr>
+                    <m:t>1</m:t>
+                  </m:r>
+                </m:num>
+                <m:den>
+                  <m:r>
+                    <w:rPr>
+                      <w:rFonts w:ascii="Cambria Math" w:hAnsi="Cambria Math"/>
+                    </w:rPr>
+                    <m:t>2</m:t>
+                  </m:r>
+                </m:den>
+              </m:f>
+              <m:r>
+                <w:rPr>
+                  <w:rFonts w:ascii="Cambria Math" w:hAnsi="Cambria Math"/>
+                </w:rPr>
+                <m:t>b</m:t>
+              </m:r>
+              <m:sSup>
+                <m:sSupPr>
+                  <m:ctrlPr>
+                    <w:rPr>
+                      <w:rFonts w:ascii="Cambria Math" w:hAnsi="Cambria Math"/>
+                      <w:i/>
+                    </w:rPr>
+                  </m:ctrlPr>
+                </m:sSupPr>
+                <m:e>
+                  <m:d>
+                    <m:dPr>
+                      <m:ctrlPr>
+                        <w:rPr>
+                          <w:rFonts w:ascii="Cambria Math" w:hAnsi="Cambria Math"/>
+                          <w:i/>
+                        </w:rPr>
+                      </m:ctrlPr>
+                    </m:dPr>
+                    <m:e>
+                      <m:r>
+                        <m:rPr>
+                          <m:sty m:val="bi"/>
+                        </m:rPr>
+                        <w:rPr>
+                          <w:rFonts w:ascii="Cambria Math" w:hAnsi="Cambria Math"/>
+                        </w:rPr>
+                        <m:t>x</m:t>
+                      </m:r>
+                      <m:r>
+                        <w:rPr>
+                          <w:rFonts w:ascii="Cambria Math" w:hAnsi="Cambria Math"/>
+                        </w:rPr>
+                        <m:t>,t</m:t>
+                      </m:r>
+                    </m:e>
+                  </m:d>
+                </m:e>
+                <m:sup>
+                  <m:r>
+                    <w:rPr>
+                      <w:rFonts w:ascii="Cambria Math" w:hAnsi="Cambria Math"/>
+                    </w:rPr>
+                    <m:t>2</m:t>
+                  </m:r>
+                </m:sup>
+              </m:sSup>
+              <m:f>
+                <m:fPr>
+                  <m:ctrlPr>
+                    <w:rPr>
+                      <w:rFonts w:ascii="Cambria Math" w:hAnsi="Cambria Math"/>
+                      <w:i/>
+                    </w:rPr>
+                  </m:ctrlPr>
+                </m:fPr>
+                <m:num>
+                  <m:sSup>
+                    <m:sSupPr>
+                      <m:ctrlPr>
+                        <w:rPr>
+                          <w:rFonts w:ascii="Cambria Math" w:hAnsi="Cambria Math"/>
+                          <w:i/>
+                        </w:rPr>
+                      </m:ctrlPr>
+                    </m:sSupPr>
+                    <m:e>
+                      <m:r>
+                        <w:rPr>
+                          <w:rFonts w:ascii="Cambria Math" w:hAnsi="Cambria Math"/>
+                        </w:rPr>
+                        <m:t>∂</m:t>
+                      </m:r>
+                    </m:e>
+                    <m:sup>
+                      <m:r>
+                        <w:rPr>
+                          <w:rFonts w:ascii="Cambria Math" w:hAnsi="Cambria Math"/>
+                        </w:rPr>
+                        <m:t>2</m:t>
+                      </m:r>
+                    </m:sup>
+                  </m:sSup>
+                  <m:sSup>
+                    <m:sSupPr>
+                      <m:ctrlPr>
+                        <w:rPr>
+                          <w:rFonts w:ascii="Cambria Math" w:hAnsi="Cambria Math"/>
+                          <w:i/>
+                        </w:rPr>
+                      </m:ctrlPr>
+                    </m:sSupPr>
+                    <m:e>
+                      <m:r>
+                        <w:rPr>
+                          <w:rFonts w:ascii="Cambria Math" w:hAnsi="Cambria Math"/>
+                        </w:rPr>
+                        <m:t>f</m:t>
+                      </m:r>
+                    </m:e>
+                    <m:sup>
+                      <m:r>
+                        <w:rPr>
+                          <w:rFonts w:ascii="Cambria Math" w:hAnsi="Cambria Math"/>
+                        </w:rPr>
+                        <m:t>*</m:t>
+                      </m:r>
+                    </m:sup>
+                  </m:sSup>
+                </m:num>
+                <m:den>
+                  <m:r>
+                    <w:rPr>
+                      <w:rFonts w:ascii="Cambria Math" w:hAnsi="Cambria Math"/>
+                    </w:rPr>
+                    <m:t>∂</m:t>
+                  </m:r>
+                  <m:sSub>
+                    <m:sSubPr>
+                      <m:ctrlPr>
+                        <w:rPr>
+                          <w:rFonts w:ascii="Cambria Math" w:hAnsi="Cambria Math"/>
+                          <w:i/>
+                        </w:rPr>
+                      </m:ctrlPr>
+                    </m:sSubPr>
+                    <m:e>
+                      <m:r>
+                        <w:rPr>
+                          <w:rFonts w:ascii="Cambria Math" w:hAnsi="Cambria Math"/>
+                        </w:rPr>
+                        <m:t>V</m:t>
+                      </m:r>
+                    </m:e>
+                    <m:sub>
+                      <m:r>
+                        <w:rPr>
+                          <w:rFonts w:ascii="Cambria Math" w:hAnsi="Cambria Math"/>
+                        </w:rPr>
+                        <m:t>i</m:t>
+                      </m:r>
+                    </m:sub>
+                  </m:sSub>
+                  <m:r>
+                    <w:rPr>
+                      <w:rFonts w:ascii="Cambria Math" w:hAnsi="Cambria Math"/>
+                    </w:rPr>
+                    <m:t>∂</m:t>
+                  </m:r>
+                  <m:sSub>
+                    <m:sSubPr>
+                      <m:ctrlPr>
+                        <w:rPr>
+                          <w:rFonts w:ascii="Cambria Math" w:hAnsi="Cambria Math"/>
+                          <w:i/>
+                        </w:rPr>
+                      </m:ctrlPr>
+                    </m:sSubPr>
+                    <m:e>
+                      <m:r>
+                        <w:rPr>
+                          <w:rFonts w:ascii="Cambria Math" w:hAnsi="Cambria Math"/>
+                        </w:rPr>
+                        <m:t>V</m:t>
+                      </m:r>
+                    </m:e>
+                    <m:sub>
+                      <m:r>
+                        <w:rPr>
+                          <w:rFonts w:ascii="Cambria Math" w:hAnsi="Cambria Math"/>
+                        </w:rPr>
+                        <m:t>i</m:t>
+                      </m:r>
+                    </m:sub>
+                  </m:sSub>
+                </m:den>
+              </m:f>
+              <m:r>
+                <w:rPr>
+                  <w:rFonts w:ascii="Cambria Math" w:hAnsi="Cambria Math"/>
+                </w:rPr>
+                <m:t>#3</m:t>
+              </m:r>
+            </m:e>
+          </m:eqArr>
+        </m:oMath>
+      </m:oMathPara>
+    </w:p>
+    <w:p>
+      <w:pPr>
+        <w:pStyle w:val="NoSpacing"/>
+        <w:rPr>
+          <w:rFonts w:eastAsiaTheme="minorEastAsia"/>
+        </w:rPr>
+      </w:pPr>
+      <w:r>
+        <w:rPr>
+          <w:rFonts w:eastAsiaTheme="minorEastAsia"/>
+        </w:rPr>
+        <w:t>Where</w:t>
+      </w:r>
+      <w:r>
+        <w:rPr>
+          <w:rFonts w:eastAsiaTheme="minorEastAsia"/>
+        </w:rPr>
+        <w:t xml:space="preserve"> </w:t>
+      </w:r>
+      <m:oMath>
+        <m:sSup>
+          <m:sSupPr>
+            <m:ctrlPr>
+              <w:rPr>
+                <w:rFonts w:ascii="Cambria Math" w:eastAsiaTheme="minorEastAsia" w:hAnsi="Cambria Math"/>
+                <w:i/>
+              </w:rPr>
+            </m:ctrlPr>
+          </m:sSupPr>
+          <m:e>
+            <m:r>
+              <w:rPr>
+                <w:rFonts w:ascii="Cambria Math" w:eastAsiaTheme="minorEastAsia" w:hAnsi="Cambria Math"/>
+              </w:rPr>
+              <m:t>f</m:t>
+            </m:r>
+          </m:e>
+          <m:sup>
+            <m:r>
+              <w:rPr>
+                <w:rFonts w:ascii="Cambria Math" w:eastAsiaTheme="minorEastAsia" w:hAnsi="Cambria Math"/>
+              </w:rPr>
+              <m:t>*</m:t>
+            </m:r>
+          </m:sup>
+        </m:sSup>
+        <m:r>
+          <w:rPr>
+            <w:rFonts w:ascii="Cambria Math" w:eastAsiaTheme="minorEastAsia" w:hAnsi="Cambria Math"/>
+          </w:rPr>
+          <m:t>(</m:t>
+        </m:r>
+        <m:r>
+          <m:rPr>
+            <m:sty m:val="bi"/>
+          </m:rPr>
+          <w:rPr>
+            <w:rFonts w:ascii="Cambria Math" w:eastAsiaTheme="minorEastAsia" w:hAnsi="Cambria Math"/>
+          </w:rPr>
+          <m:t>V|x</m:t>
+        </m:r>
+        <m:r>
+          <w:rPr>
+            <w:rFonts w:ascii="Cambria Math" w:eastAsiaTheme="minorEastAsia" w:hAnsi="Cambria Math"/>
+          </w:rPr>
+          <m:t>,t)</m:t>
+        </m:r>
+      </m:oMath>
+      <w:r>
+        <w:rPr>
+          <w:rFonts w:eastAsiaTheme="minorEastAsia"/>
+        </w:rPr>
+        <w:t xml:space="preserve"> is the conditional PDF of the particle velocity, </w:t>
+      </w:r>
+      <m:oMath>
+        <m:sSub>
+          <m:sSubPr>
+            <m:ctrlPr>
+              <w:rPr>
+                <w:rFonts w:ascii="Cambria Math" w:eastAsiaTheme="minorEastAsia" w:hAnsi="Cambria Math"/>
+                <w:i/>
+              </w:rPr>
+            </m:ctrlPr>
+          </m:sSubPr>
+          <m:e>
+            <m:r>
+              <w:rPr>
+                <w:rFonts w:ascii="Cambria Math" w:eastAsiaTheme="minorEastAsia" w:hAnsi="Cambria Math"/>
+              </w:rPr>
+              <m:t>a</m:t>
+            </m:r>
+          </m:e>
+          <m:sub>
+            <m:r>
+              <w:rPr>
+                <w:rFonts w:ascii="Cambria Math" w:eastAsiaTheme="minorEastAsia" w:hAnsi="Cambria Math"/>
+              </w:rPr>
+              <m:t>i</m:t>
+            </m:r>
+          </m:sub>
+        </m:sSub>
+        <m:d>
+          <m:dPr>
+            <m:ctrlPr>
+              <w:rPr>
+                <w:rFonts w:ascii="Cambria Math" w:eastAsiaTheme="minorEastAsia" w:hAnsi="Cambria Math"/>
+                <w:i/>
+              </w:rPr>
+            </m:ctrlPr>
+          </m:dPr>
+          <m:e>
+            <m:r>
+              <m:rPr>
+                <m:sty m:val="bi"/>
+              </m:rPr>
+              <w:rPr>
+                <w:rFonts w:ascii="Cambria Math" w:eastAsiaTheme="minorEastAsia" w:hAnsi="Cambria Math"/>
+              </w:rPr>
+              <m:t>V, x</m:t>
+            </m:r>
+            <m:r>
+              <w:rPr>
+                <w:rFonts w:ascii="Cambria Math" w:eastAsiaTheme="minorEastAsia" w:hAnsi="Cambria Math"/>
+              </w:rPr>
+              <m:t>,t</m:t>
+            </m:r>
+          </m:e>
+        </m:d>
+      </m:oMath>
+      <w:r>
+        <w:rPr>
+          <w:rFonts w:eastAsiaTheme="minorEastAsia"/>
+        </w:rPr>
+        <w:t xml:space="preserve"> is the drift coefficient, and </w:t>
+      </w:r>
+      <m:oMath>
+        <m:r>
+          <w:rPr>
+            <w:rFonts w:ascii="Cambria Math" w:eastAsiaTheme="minorEastAsia" w:hAnsi="Cambria Math"/>
+          </w:rPr>
+          <m:t>b</m:t>
+        </m:r>
+        <m:d>
+          <m:dPr>
+            <m:ctrlPr>
+              <w:rPr>
+                <w:rFonts w:ascii="Cambria Math" w:eastAsiaTheme="minorEastAsia" w:hAnsi="Cambria Math"/>
+                <w:i/>
+              </w:rPr>
+            </m:ctrlPr>
+          </m:dPr>
+          <m:e>
+            <m:r>
+              <m:rPr>
+                <m:sty m:val="bi"/>
+              </m:rPr>
+              <w:rPr>
+                <w:rFonts w:ascii="Cambria Math" w:eastAsiaTheme="minorEastAsia" w:hAnsi="Cambria Math"/>
+              </w:rPr>
+              <m:t>x</m:t>
+            </m:r>
+            <m:r>
+              <w:rPr>
+                <w:rFonts w:ascii="Cambria Math" w:eastAsiaTheme="minorEastAsia" w:hAnsi="Cambria Math"/>
+              </w:rPr>
+              <m:t>,t</m:t>
+            </m:r>
+          </m:e>
+        </m:d>
+      </m:oMath>
+      <w:r>
+        <w:rPr>
+          <w:rFonts w:eastAsiaTheme="minorEastAsia"/>
+        </w:rPr>
+        <w:t xml:space="preserve"> is the diffusion coefficient.</w:t>
+      </w:r>
+      <w:r>
+        <w:rPr>
+          <w:rFonts w:eastAsiaTheme="minorEastAsia"/>
+        </w:rPr>
+        <w:t xml:space="preserve"> </w:t>
+      </w:r>
+      <w:r>
+        <w:rPr>
+          <w:rFonts w:eastAsiaTheme="minorEastAsia"/>
+        </w:rPr>
+        <w:t xml:space="preserve">The drift coefficient </w:t>
+      </w:r>
+      <w:r>
+        <w:rPr>
+          <w:rFonts w:eastAsiaTheme="minorEastAsia"/>
+        </w:rPr>
+        <w:t>effectively describes the direction and speed of the system if no randomness were present</w:t>
+      </w:r>
+      <w:r>
+        <w:rPr>
+          <w:rFonts w:eastAsiaTheme="minorEastAsia"/>
+        </w:rPr>
+        <w:t xml:space="preserve">, </w:t>
+      </w:r>
+      <w:r>
+        <w:rPr>
+          <w:rFonts w:eastAsiaTheme="minorEastAsia"/>
+        </w:rPr>
+        <w:t xml:space="preserve">and the diffusion coefficient determines the intensity of the random </w:t>
+      </w:r>
+      <w:r>
+        <w:rPr>
+          <w:rFonts w:eastAsiaTheme="minorEastAsia"/>
+        </w:rPr>
+        <w:t>fluctuations</w:t>
+      </w:r>
+      <w:r>
+        <w:rPr>
+          <w:rFonts w:eastAsiaTheme="minorEastAsia"/>
+        </w:rPr>
+        <w:t xml:space="preserve"> induced by the vector-valued Wiener process </w:t>
+      </w:r>
+      <m:oMath>
+        <m:r>
+          <m:rPr>
+            <m:sty m:val="bi"/>
+          </m:rPr>
+          <w:rPr>
+            <w:rFonts w:ascii="Cambria Math" w:eastAsiaTheme="minorEastAsia" w:hAnsi="Cambria Math"/>
+          </w:rPr>
+          <m:t>W</m:t>
+        </m:r>
+        <m:r>
+          <w:rPr>
+            <w:rFonts w:ascii="Cambria Math" w:eastAsiaTheme="minorEastAsia" w:hAnsi="Cambria Math"/>
+          </w:rPr>
+          <m:t>(t)</m:t>
+        </m:r>
+      </m:oMath>
+      <w:r>
+        <w:rPr>
+          <w:rFonts w:eastAsiaTheme="minorEastAsia"/>
+        </w:rPr>
+        <w:t>.</w:t>
+      </w:r>
+      <w:r>
+        <w:rPr>
+          <w:rFonts w:eastAsiaTheme="minorEastAsia"/>
+        </w:rPr>
+        <w:t xml:space="preserve"> </w:t>
+      </w:r>
+      <w:r>
+        <w:rPr>
+          <w:rFonts w:eastAsiaTheme="minorEastAsia"/>
+        </w:rPr>
+        <w:t xml:space="preserve">To derive </w:t>
+      </w:r>
+      <w:r>
+        <w:rPr>
+          <w:rFonts w:eastAsiaTheme="minorEastAsia"/>
+        </w:rPr>
+        <w:t>E</w:t>
+      </w:r>
+      <w:r>
+        <w:rPr>
+          <w:rFonts w:eastAsiaTheme="minorEastAsia"/>
+        </w:rPr>
+        <w:t>quation 3, Pope expressed a generalized Langevin model for the diffusion process to describe the evolution of the velocity of a fluid particle:</w:t>
+      </w:r>
+    </w:p>
+    <w:p>
+      <w:pPr>
+        <w:pStyle w:val="NoSpacing"/>
+        <w:rPr>
+          <w:rFonts w:eastAsiaTheme="minorEastAsia"/>
+          <w:b/>
+          <w:bCs/>
+        </w:rPr>
+      </w:pPr>
+      <m:oMathPara>
+        <m:oMath>
+          <m:r>
+            <w:rPr>
+              <w:rFonts w:ascii="Cambria Math" w:eastAsiaTheme="minorEastAsia" w:hAnsi="Cambria Math"/>
+            </w:rPr>
+            <m:t>d</m:t>
+          </m:r>
+          <m:sSup>
+            <m:sSupPr>
+              <m:ctrlPr>
+                <w:rPr>
+                  <w:rFonts w:ascii="Cambria Math" w:eastAsiaTheme="minorEastAsia" w:hAnsi="Cambria Math"/>
+                  <w:b/>
+                  <w:bCs/>
+                  <w:i/>
+                </w:rPr>
+              </m:ctrlPr>
+            </m:sSupPr>
+            <m:e>
+              <m:r>
+                <m:rPr>
+                  <m:sty m:val="bi"/>
+                </m:rPr>
+                <w:rPr>
+                  <w:rFonts w:ascii="Cambria Math" w:eastAsiaTheme="minorEastAsia" w:hAnsi="Cambria Math"/>
+                </w:rPr>
+                <m:t>U</m:t>
+              </m:r>
+            </m:e>
+            <m:sup>
+              <m:r>
+                <m:rPr>
+                  <m:sty m:val="bi"/>
+                </m:rPr>
+                <w:rPr>
+                  <w:rFonts w:ascii="Cambria Math" w:eastAsiaTheme="minorEastAsia" w:hAnsi="Cambria Math"/>
+                </w:rPr>
+                <m:t>*</m:t>
+              </m:r>
+            </m:sup>
+          </m:sSup>
+          <m:d>
+            <m:dPr>
+              <m:ctrlPr>
+                <w:rPr>
+                  <w:rFonts w:ascii="Cambria Math" w:eastAsiaTheme="minorEastAsia" w:hAnsi="Cambria Math"/>
+                  <w:i/>
+                </w:rPr>
+              </m:ctrlPr>
+            </m:dPr>
+            <m:e>
+              <m:r>
+                <w:rPr>
+                  <w:rFonts w:ascii="Cambria Math" w:eastAsiaTheme="minorEastAsia" w:hAnsi="Cambria Math"/>
+                </w:rPr>
+                <m:t>t</m:t>
+              </m:r>
+            </m:e>
+          </m:d>
+          <m:r>
+            <w:rPr>
+              <w:rFonts w:ascii="Cambria Math" w:eastAsiaTheme="minorEastAsia" w:hAnsi="Cambria Math"/>
+            </w:rPr>
+            <m:t>=</m:t>
+          </m:r>
+          <m:r>
+            <m:rPr>
+              <m:sty m:val="bi"/>
+            </m:rPr>
+            <w:rPr>
+              <w:rFonts w:ascii="Cambria Math" w:eastAsiaTheme="minorEastAsia" w:hAnsi="Cambria Math"/>
+            </w:rPr>
+            <m:t>a</m:t>
+          </m:r>
+          <m:d>
+            <m:dPr>
+              <m:ctrlPr>
+                <w:rPr>
+                  <w:rFonts w:ascii="Cambria Math" w:eastAsiaTheme="minorEastAsia" w:hAnsi="Cambria Math"/>
+                  <w:b/>
+                  <w:bCs/>
+                  <w:i/>
+                </w:rPr>
+              </m:ctrlPr>
+            </m:dPr>
+            <m:e>
+              <m:sSup>
+                <m:sSupPr>
+                  <m:ctrlPr>
+                    <w:rPr>
+                      <w:rFonts w:ascii="Cambria Math" w:eastAsiaTheme="minorEastAsia" w:hAnsi="Cambria Math"/>
+                      <w:b/>
+                      <w:bCs/>
+                      <w:i/>
+                    </w:rPr>
+                  </m:ctrlPr>
+                </m:sSupPr>
+                <m:e>
+                  <m:r>
+                    <m:rPr>
+                      <m:sty m:val="bi"/>
+                    </m:rPr>
+                    <w:rPr>
+                      <w:rFonts w:ascii="Cambria Math" w:eastAsiaTheme="minorEastAsia" w:hAnsi="Cambria Math"/>
+                    </w:rPr>
+                    <m:t>U</m:t>
+                  </m:r>
+                </m:e>
+                <m:sup>
+                  <m:r>
+                    <m:rPr>
+                      <m:sty m:val="bi"/>
+                    </m:rPr>
+                    <w:rPr>
+                      <w:rFonts w:ascii="Cambria Math" w:eastAsiaTheme="minorEastAsia" w:hAnsi="Cambria Math"/>
+                    </w:rPr>
+                    <m:t>*</m:t>
+                  </m:r>
+                </m:sup>
+              </m:sSup>
+              <m:d>
+                <m:dPr>
+                  <m:ctrlPr>
+                    <w:rPr>
+                      <w:rFonts w:ascii="Cambria Math" w:eastAsiaTheme="minorEastAsia" w:hAnsi="Cambria Math"/>
+                      <w:i/>
+                    </w:rPr>
+                  </m:ctrlPr>
+                </m:dPr>
+                <m:e>
+                  <m:r>
+                    <w:rPr>
+                      <w:rFonts w:ascii="Cambria Math" w:eastAsiaTheme="minorEastAsia" w:hAnsi="Cambria Math"/>
+                    </w:rPr>
+                    <m:t>t</m:t>
+                  </m:r>
+                </m:e>
+              </m:d>
+              <m:r>
+                <m:rPr>
+                  <m:sty m:val="bi"/>
+                </m:rPr>
+                <w:rPr>
+                  <w:rFonts w:ascii="Cambria Math" w:eastAsiaTheme="minorEastAsia" w:hAnsi="Cambria Math"/>
+                </w:rPr>
+                <m:t xml:space="preserve">, </m:t>
+              </m:r>
+              <m:sSup>
+                <m:sSupPr>
+                  <m:ctrlPr>
+                    <w:rPr>
+                      <w:rFonts w:ascii="Cambria Math" w:eastAsiaTheme="minorEastAsia" w:hAnsi="Cambria Math"/>
+                      <w:b/>
+                      <w:bCs/>
+                      <w:i/>
+                    </w:rPr>
+                  </m:ctrlPr>
+                </m:sSupPr>
+                <m:e>
+                  <m:r>
+                    <m:rPr>
+                      <m:sty m:val="bi"/>
+                    </m:rPr>
+                    <w:rPr>
+                      <w:rFonts w:ascii="Cambria Math" w:eastAsiaTheme="minorEastAsia" w:hAnsi="Cambria Math"/>
+                    </w:rPr>
+                    <m:t>X</m:t>
+                  </m:r>
+                </m:e>
+                <m:sup>
+                  <m:r>
+                    <m:rPr>
+                      <m:sty m:val="bi"/>
+                    </m:rPr>
+                    <w:rPr>
+                      <w:rFonts w:ascii="Cambria Math" w:eastAsiaTheme="minorEastAsia" w:hAnsi="Cambria Math"/>
+                    </w:rPr>
+                    <m:t>*</m:t>
+                  </m:r>
+                </m:sup>
+              </m:sSup>
+              <m:d>
+                <m:dPr>
+                  <m:ctrlPr>
+                    <w:rPr>
+                      <w:rFonts w:ascii="Cambria Math" w:eastAsiaTheme="minorEastAsia" w:hAnsi="Cambria Math"/>
+                      <w:i/>
+                    </w:rPr>
+                  </m:ctrlPr>
+                </m:dPr>
+                <m:e>
+                  <m:r>
+                    <w:rPr>
+                      <w:rFonts w:ascii="Cambria Math" w:eastAsiaTheme="minorEastAsia" w:hAnsi="Cambria Math"/>
+                    </w:rPr>
+                    <m:t>t</m:t>
+                  </m:r>
+                </m:e>
+              </m:d>
+              <m:r>
+                <w:rPr>
+                  <w:rFonts w:ascii="Cambria Math" w:eastAsiaTheme="minorEastAsia" w:hAnsi="Cambria Math"/>
+                </w:rPr>
+                <m:t>, t</m:t>
+              </m:r>
+              <m:ctrlPr>
+                <w:rPr>
+                  <w:rFonts w:ascii="Cambria Math" w:eastAsiaTheme="minorEastAsia" w:hAnsi="Cambria Math"/>
+                  <w:i/>
+                </w:rPr>
+              </m:ctrlPr>
+            </m:e>
+          </m:d>
+          <m:r>
+            <w:rPr>
+              <w:rFonts w:ascii="Cambria Math" w:eastAsiaTheme="minorEastAsia" w:hAnsi="Cambria Math"/>
+            </w:rPr>
+            <m:t>dt+b</m:t>
+          </m:r>
+          <m:d>
+            <m:dPr>
+              <m:ctrlPr>
+                <w:rPr>
+                  <w:rFonts w:ascii="Cambria Math" w:eastAsiaTheme="minorEastAsia" w:hAnsi="Cambria Math"/>
+                  <w:i/>
+                </w:rPr>
+              </m:ctrlPr>
+            </m:dPr>
+            <m:e>
+              <m:sSup>
+                <m:sSupPr>
+                  <m:ctrlPr>
+                    <w:rPr>
+                      <w:rFonts w:ascii="Cambria Math" w:eastAsiaTheme="minorEastAsia" w:hAnsi="Cambria Math"/>
+                      <w:b/>
+                      <w:bCs/>
+                      <w:i/>
+                    </w:rPr>
+                  </m:ctrlPr>
+                </m:sSupPr>
+                <m:e>
+                  <m:r>
+                    <m:rPr>
+                      <m:sty m:val="bi"/>
+                    </m:rPr>
+                    <w:rPr>
+                      <w:rFonts w:ascii="Cambria Math" w:eastAsiaTheme="minorEastAsia" w:hAnsi="Cambria Math"/>
+                    </w:rPr>
+                    <m:t>X</m:t>
+                  </m:r>
+                  <m:ctrlPr>
+                    <w:rPr>
+                      <w:rFonts w:ascii="Cambria Math" w:eastAsiaTheme="minorEastAsia" w:hAnsi="Cambria Math"/>
+                      <w:i/>
+                    </w:rPr>
+                  </m:ctrlPr>
+                </m:e>
+                <m:sup>
+                  <m:r>
+                    <m:rPr>
+                      <m:sty m:val="bi"/>
+                    </m:rPr>
+                    <w:rPr>
+                      <w:rFonts w:ascii="Cambria Math" w:eastAsiaTheme="minorEastAsia" w:hAnsi="Cambria Math"/>
+                    </w:rPr>
+                    <m:t>*</m:t>
+                  </m:r>
+                </m:sup>
+              </m:sSup>
+              <m:d>
+                <m:dPr>
+                  <m:ctrlPr>
+                    <w:rPr>
+                      <w:rFonts w:ascii="Cambria Math" w:eastAsiaTheme="minorEastAsia" w:hAnsi="Cambria Math"/>
+                      <w:i/>
+                    </w:rPr>
+                  </m:ctrlPr>
+                </m:dPr>
+                <m:e>
+                  <m:r>
+                    <w:rPr>
+                      <w:rFonts w:ascii="Cambria Math" w:eastAsiaTheme="minorEastAsia" w:hAnsi="Cambria Math"/>
+                    </w:rPr>
+                    <m:t>t</m:t>
+                  </m:r>
+                </m:e>
+              </m:d>
+              <m:r>
+                <w:rPr>
+                  <w:rFonts w:ascii="Cambria Math" w:eastAsiaTheme="minorEastAsia" w:hAnsi="Cambria Math"/>
+                </w:rPr>
+                <m:t>, t</m:t>
+              </m:r>
+            </m:e>
+          </m:d>
+          <m:r>
+            <w:rPr>
+              <w:rFonts w:ascii="Cambria Math" w:eastAsiaTheme="minorEastAsia" w:hAnsi="Cambria Math"/>
+            </w:rPr>
+            <m:t>d</m:t>
+          </m:r>
+          <m:r>
+            <m:rPr>
+              <m:sty m:val="bi"/>
+            </m:rPr>
+            <w:rPr>
+              <w:rFonts w:ascii="Cambria Math" w:eastAsiaTheme="minorEastAsia" w:hAnsi="Cambria Math"/>
+            </w:rPr>
+            <m:t>W</m:t>
+          </m:r>
+        </m:oMath>
+      </m:oMathPara>
+    </w:p>
+    <w:p>
+      <w:pPr>
+        <w:pStyle w:val="NoSpacing"/>
+        <w:rPr>
+          <w:rFonts w:eastAsiaTheme="minorEastAsia"/>
+          <w:b/>
+          <w:bCs/>
+        </w:rPr>
+      </w:pPr>
+      <w:r>
+        <w:rPr>
+          <w:rFonts w:eastAsiaTheme="minorEastAsia"/>
+        </w:rPr>
+        <w:t>he</w:t>
+      </w:r>
+      <w:r>
+        <w:rPr>
+          <w:rFonts w:eastAsiaTheme="minorEastAsia"/>
+        </w:rPr>
+        <w:t xml:space="preserve"> then </w:t>
+      </w:r>
+      <w:r>
+        <w:rPr>
+          <w:rFonts w:eastAsiaTheme="minorEastAsia"/>
+        </w:rPr>
+        <w:t>used stochastic</w:t>
+      </w:r>
+      <w:r>
+        <w:rPr>
+          <w:rFonts w:eastAsiaTheme="minorEastAsia"/>
+        </w:rPr>
+        <w:t xml:space="preserve"> </w:t>
+      </w:r>
+      <w:r>
+        <w:rPr>
+          <w:rFonts w:eastAsiaTheme="minorEastAsia"/>
+        </w:rPr>
+        <w:t>(more specifically Ito) calculus</w:t>
+      </w:r>
+      <w:r>
+        <w:rPr>
+          <w:rFonts w:eastAsiaTheme="minorEastAsia"/>
+        </w:rPr>
+        <w:t xml:space="preserve"> to obtain the Fokker-Plank equation</w:t>
+      </w:r>
+      <w:r>
+        <w:rPr>
+          <w:rFonts w:eastAsiaTheme="minorEastAsia"/>
+        </w:rPr>
+        <w:t xml:space="preserve"> for</w:t>
+      </w:r>
+      <w:r>
+        <w:rPr>
+          <w:rFonts w:eastAsiaTheme="minorEastAsia"/>
+        </w:rPr>
+        <w:t xml:space="preserve"> the joint Lagrangian PDF of the particle position and velocity,</w:t>
+      </w:r>
+      <w:r>
+        <w:rPr>
+          <w:rFonts w:eastAsiaTheme="minorEastAsia"/>
+        </w:rPr>
+        <w:t xml:space="preserve"> </w:t>
+      </w:r>
+      <m:oMath>
+        <m:sSubSup>
+          <m:sSubSupPr>
+            <m:ctrlPr>
+              <w:rPr>
+                <w:rFonts w:ascii="Cambria Math" w:eastAsiaTheme="minorEastAsia" w:hAnsi="Cambria Math"/>
+                <w:i/>
+              </w:rPr>
+            </m:ctrlPr>
+          </m:sSubSupPr>
+          <m:e>
+            <m:r>
+              <w:rPr>
+                <w:rFonts w:ascii="Cambria Math" w:eastAsiaTheme="minorEastAsia" w:hAnsi="Cambria Math"/>
+              </w:rPr>
+              <m:t>f</m:t>
+            </m:r>
+          </m:e>
+          <m:sub>
+            <m:r>
+              <w:rPr>
+                <w:rFonts w:ascii="Cambria Math" w:eastAsiaTheme="minorEastAsia" w:hAnsi="Cambria Math"/>
+              </w:rPr>
+              <m:t>L</m:t>
+            </m:r>
+          </m:sub>
+          <m:sup>
+            <m:r>
+              <w:rPr>
+                <w:rFonts w:ascii="Cambria Math" w:eastAsiaTheme="minorEastAsia" w:hAnsi="Cambria Math"/>
+              </w:rPr>
+              <m:t>*</m:t>
+            </m:r>
+          </m:sup>
+        </m:sSubSup>
+        <m:r>
+          <w:rPr>
+            <w:rFonts w:ascii="Cambria Math" w:eastAsiaTheme="minorEastAsia" w:hAnsi="Cambria Math"/>
+          </w:rPr>
+          <m:t>(</m:t>
+        </m:r>
+        <m:r>
+          <m:rPr>
+            <m:sty m:val="bi"/>
+          </m:rPr>
+          <w:rPr>
+            <w:rFonts w:ascii="Cambria Math" w:eastAsiaTheme="minorEastAsia" w:hAnsi="Cambria Math"/>
+          </w:rPr>
+          <m:t>V, x</m:t>
+        </m:r>
+        <m:r>
+          <w:rPr>
+            <w:rFonts w:ascii="Cambria Math" w:eastAsiaTheme="minorEastAsia" w:hAnsi="Cambria Math"/>
+          </w:rPr>
+          <m:t>;t)</m:t>
+        </m:r>
+      </m:oMath>
+      <w:r>
+        <w:rPr>
+          <w:rFonts w:eastAsiaTheme="minorEastAsia"/>
+        </w:rPr>
+        <w:t xml:space="preserve">, and </w:t>
+      </w:r>
+      <w:r>
+        <w:rPr>
+          <w:rFonts w:eastAsiaTheme="minorEastAsia"/>
+        </w:rPr>
+        <w:t>then divided</w:t>
+      </w:r>
+      <w:r>
+        <w:rPr>
+          <w:rFonts w:eastAsiaTheme="minorEastAsia"/>
+        </w:rPr>
+        <w:t xml:space="preserve"> </w:t>
+      </w:r>
+      <w:r>
+        <w:rPr>
+          <w:rFonts w:eastAsiaTheme="minorEastAsia"/>
+        </w:rPr>
+        <w:t xml:space="preserve">the result </w:t>
+      </w:r>
+      <w:r>
+        <w:rPr>
+          <w:rFonts w:eastAsiaTheme="minorEastAsia"/>
+        </w:rPr>
+        <w:t>by</w:t>
+      </w:r>
+      <w:r>
+        <w:rPr>
+          <w:rFonts w:eastAsiaTheme="minorEastAsia"/>
+        </w:rPr>
+        <w:t xml:space="preserve"> the marginal position PDF,</w:t>
+      </w:r>
+      <w:r>
+        <w:rPr>
+          <w:rFonts w:eastAsiaTheme="minorEastAsia"/>
+        </w:rPr>
+        <w:t xml:space="preserve"> </w:t>
+      </w:r>
+      <m:oMath>
+        <m:sSubSup>
+          <m:sSubSupPr>
+            <m:ctrlPr>
+              <w:rPr>
+                <w:rFonts w:ascii="Cambria Math" w:eastAsiaTheme="minorEastAsia" w:hAnsi="Cambria Math"/>
+                <w:i/>
+              </w:rPr>
+            </m:ctrlPr>
+          </m:sSubSupPr>
+          <m:e>
+            <m:r>
+              <w:rPr>
+                <w:rFonts w:ascii="Cambria Math" w:eastAsiaTheme="minorEastAsia" w:hAnsi="Cambria Math"/>
+              </w:rPr>
+              <m:t>f</m:t>
+            </m:r>
+          </m:e>
+          <m:sub>
+            <m:r>
+              <m:rPr>
+                <m:sty m:val="bi"/>
+              </m:rPr>
+              <w:rPr>
+                <w:rFonts w:ascii="Cambria Math" w:eastAsiaTheme="minorEastAsia" w:hAnsi="Cambria Math"/>
+              </w:rPr>
+              <m:t>X</m:t>
+            </m:r>
+          </m:sub>
+          <m:sup>
+            <m:r>
+              <w:rPr>
+                <w:rFonts w:ascii="Cambria Math" w:eastAsiaTheme="minorEastAsia" w:hAnsi="Cambria Math"/>
+              </w:rPr>
+              <m:t>*</m:t>
+            </m:r>
+          </m:sup>
+        </m:sSubSup>
+        <m:r>
+          <w:rPr>
+            <w:rFonts w:ascii="Cambria Math" w:eastAsiaTheme="minorEastAsia" w:hAnsi="Cambria Math"/>
+          </w:rPr>
+          <m:t>(</m:t>
+        </m:r>
+        <m:r>
+          <m:rPr>
+            <m:sty m:val="bi"/>
+          </m:rPr>
+          <w:rPr>
+            <w:rFonts w:ascii="Cambria Math" w:eastAsiaTheme="minorEastAsia" w:hAnsi="Cambria Math"/>
+          </w:rPr>
+          <m:t>x,</m:t>
+        </m:r>
+        <m:r>
+          <w:rPr>
+            <w:rFonts w:ascii="Cambria Math" w:eastAsiaTheme="minorEastAsia" w:hAnsi="Cambria Math"/>
+          </w:rPr>
+          <m:t>t)</m:t>
+        </m:r>
+      </m:oMath>
+      <w:r>
+        <w:rPr>
+          <w:rFonts w:eastAsiaTheme="minorEastAsia"/>
+        </w:rPr>
+        <w:t>.</w:t>
+      </w:r>
+      <w:r>
+        <w:rPr>
+          <w:rFonts w:eastAsiaTheme="minorEastAsia"/>
+        </w:rPr>
+        <w:t>[3]</w:t>
+      </w:r>
+      <w:r>
+        <w:rPr>
+          <w:rFonts w:eastAsiaTheme="minorEastAsia"/>
+          <w:b/>
+          <w:bCs/>
+        </w:rPr>
+        <w:t xml:space="preserve"> </w:t>
+      </w:r>
+    </w:p>
+    <w:p>
+      <w:pPr>
+        <w:pStyle w:val="NoSpacing"/>
+        <w:rPr>
+          <w:rFonts w:eastAsiaTheme="minorEastAsia"/>
+        </w:rPr>
+      </w:pPr>
+      <w:r>
+        <w:rPr>
+          <w:rFonts w:eastAsiaTheme="minorEastAsia"/>
+          <w:b/>
+          <w:bCs/>
+        </w:rPr>
+        <w:tab/>
+      </w:r>
+      <w:r>
+        <w:rPr>
+          <w:rFonts w:eastAsiaTheme="minorEastAsia"/>
+        </w:rPr>
+        <w:t xml:space="preserve">When introducing </w:t>
+      </w:r>
+      <w:r>
+        <w:rPr>
+          <w:rFonts w:eastAsiaTheme="minorEastAsia"/>
+        </w:rPr>
+        <w:t xml:space="preserve">the Langevin equation, Pope stated that it was “originally proposed as a stochastic model for the velocity of a microscopic particle undergoing Brownian motion.” [3] </w:t>
+      </w:r>
+      <w:r>
+        <w:rPr>
+          <w:rFonts w:eastAsiaTheme="minorEastAsia"/>
+        </w:rPr>
+        <w:t xml:space="preserve">This is significant to the argument of this paper, because in </w:t>
+      </w:r>
+      <w:r>
+        <w:rPr>
+          <w:rFonts w:eastAsiaTheme="minorEastAsia"/>
+          <w:i/>
+          <w:iCs/>
+        </w:rPr>
+        <w:t>Stochastic Calculus for Finance II- Continuous-Time Models</w:t>
+      </w:r>
+      <w:r>
+        <w:rPr>
+          <w:rFonts w:eastAsiaTheme="minorEastAsia"/>
+        </w:rPr>
+        <w:t>, by Steven E. Shreve, Shreve derives the Black-Scholes-Merton partial differential equation, starting with the price of a stock “modeled by the geometric Brownian motion”</w:t>
+      </w:r>
+      <w:r>
+        <w:rPr>
+          <w:rFonts w:eastAsiaTheme="minorEastAsia"/>
+        </w:rPr>
+        <w:t xml:space="preserve"> </w:t>
+      </w:r>
+      <w:r>
+        <w:rPr>
+          <w:rFonts w:eastAsiaTheme="minorEastAsia"/>
+        </w:rPr>
+        <w:t xml:space="preserve">[5] illustrated in the </w:t>
+      </w:r>
+      <w:r>
+        <w:rPr>
+          <w:rFonts w:eastAsiaTheme="minorEastAsia"/>
+        </w:rPr>
+        <w:t>S</w:t>
+      </w:r>
+      <w:r>
+        <w:rPr>
+          <w:rFonts w:eastAsiaTheme="minorEastAsia"/>
+        </w:rPr>
+        <w:t xml:space="preserve">tochastic </w:t>
+      </w:r>
+      <w:r>
+        <w:rPr>
+          <w:rFonts w:eastAsiaTheme="minorEastAsia"/>
+        </w:rPr>
+        <w:t>D</w:t>
+      </w:r>
+      <w:r>
+        <w:rPr>
+          <w:rFonts w:eastAsiaTheme="minorEastAsia"/>
+        </w:rPr>
+        <w:t xml:space="preserve">ifferential </w:t>
+      </w:r>
+      <w:r>
+        <w:rPr>
+          <w:rFonts w:eastAsiaTheme="minorEastAsia"/>
+        </w:rPr>
+        <w:t>E</w:t>
+      </w:r>
+      <w:r>
+        <w:rPr>
+          <w:rFonts w:eastAsiaTheme="minorEastAsia"/>
+        </w:rPr>
+        <w:t>quation below:</w:t>
+      </w:r>
+    </w:p>
+    <w:p>
+      <w:pPr>
+        <w:pStyle w:val="NoSpacing"/>
+        <w:rPr>
+          <w:rFonts w:eastAsiaTheme="minorEastAsia"/>
+        </w:rPr>
+      </w:pPr>
+      <m:oMathPara>
+        <m:oMath>
+          <m:eqArr>
+            <m:eqArrPr>
+              <m:maxDist m:val="1"/>
+              <m:ctrlPr>
+                <w:rPr>
+                  <w:rFonts w:ascii="Cambria Math" w:hAnsi="Cambria Math"/>
+                  <w:i/>
+                </w:rPr>
+              </m:ctrlPr>
+            </m:eqArrPr>
+            <m:e>
+              <m:r>
+                <w:rPr>
+                  <w:rFonts w:ascii="Cambria Math" w:hAnsi="Cambria Math"/>
+                </w:rPr>
+                <m:t>dS</m:t>
+              </m:r>
+              <m:d>
+                <m:dPr>
+                  <m:ctrlPr>
+                    <w:rPr>
+                      <w:rFonts w:ascii="Cambria Math" w:hAnsi="Cambria Math"/>
+                      <w:i/>
+                    </w:rPr>
+                  </m:ctrlPr>
+                </m:dPr>
+                <m:e>
+                  <m:r>
+                    <w:rPr>
+                      <w:rFonts w:ascii="Cambria Math" w:hAnsi="Cambria Math"/>
+                    </w:rPr>
+                    <m:t>t</m:t>
+                  </m:r>
+                </m:e>
+              </m:d>
+              <m:r>
+                <w:rPr>
+                  <w:rFonts w:ascii="Cambria Math" w:hAnsi="Cambria Math"/>
+                </w:rPr>
+                <m:t>=αS</m:t>
+              </m:r>
+              <m:d>
+                <m:dPr>
+                  <m:ctrlPr>
+                    <w:rPr>
+                      <w:rFonts w:ascii="Cambria Math" w:hAnsi="Cambria Math"/>
+                      <w:i/>
+                    </w:rPr>
+                  </m:ctrlPr>
+                </m:dPr>
+                <m:e>
+                  <m:r>
+                    <w:rPr>
+                      <w:rFonts w:ascii="Cambria Math" w:hAnsi="Cambria Math"/>
+                    </w:rPr>
+                    <m:t>t</m:t>
+                  </m:r>
+                </m:e>
+              </m:d>
+              <m:r>
+                <w:rPr>
+                  <w:rFonts w:ascii="Cambria Math" w:hAnsi="Cambria Math"/>
+                </w:rPr>
+                <m:t>dt+σS</m:t>
+              </m:r>
+              <m:d>
+                <m:dPr>
+                  <m:ctrlPr>
+                    <w:rPr>
+                      <w:rFonts w:ascii="Cambria Math" w:hAnsi="Cambria Math"/>
+                      <w:i/>
+                    </w:rPr>
+                  </m:ctrlPr>
+                </m:dPr>
+                <m:e>
+                  <m:r>
+                    <w:rPr>
+                      <w:rFonts w:ascii="Cambria Math" w:hAnsi="Cambria Math"/>
+                    </w:rPr>
+                    <m:t>t</m:t>
+                  </m:r>
+                </m:e>
+              </m:d>
+              <m:r>
+                <w:rPr>
+                  <w:rFonts w:ascii="Cambria Math" w:hAnsi="Cambria Math"/>
+                </w:rPr>
+                <m:t>dW</m:t>
+              </m:r>
+              <m:d>
+                <m:dPr>
+                  <m:ctrlPr>
+                    <w:rPr>
+                      <w:rFonts w:ascii="Cambria Math" w:hAnsi="Cambria Math"/>
+                      <w:i/>
+                    </w:rPr>
+                  </m:ctrlPr>
+                </m:dPr>
+                <m:e>
+                  <m:r>
+                    <w:rPr>
+                      <w:rFonts w:ascii="Cambria Math" w:hAnsi="Cambria Math"/>
+                    </w:rPr>
+                    <m:t>t</m:t>
+                  </m:r>
+                </m:e>
+              </m:d>
+              <m:r>
+                <w:rPr>
+                  <w:rFonts w:ascii="Cambria Math" w:hAnsi="Cambria Math"/>
+                </w:rPr>
+                <m:t>#4</m:t>
+              </m:r>
+            </m:e>
+          </m:eqArr>
+        </m:oMath>
+      </m:oMathPara>
+    </w:p>
+    <w:p>
+      <w:pPr>
+        <w:pStyle w:val="NoSpacing"/>
+        <w:rPr>
+          <w:rFonts w:eastAsiaTheme="minorEastAsia"/>
+        </w:rPr>
+      </w:pPr>
+      <w:r>
+        <w:rPr>
+          <w:rFonts w:eastAsiaTheme="minorEastAsia"/>
+        </w:rPr>
+        <w:t xml:space="preserve">Therefore, one must conclude that since the Black-Scholes-Merton equation and the transported PDF equation for a particle velocity were derived from the same general </w:t>
+      </w:r>
+      <w:r>
+        <w:rPr>
+          <w:rFonts w:eastAsiaTheme="minorEastAsia"/>
+        </w:rPr>
+        <w:t>form SDE, they must be effectively different versions of the same general transport equation.</w:t>
+      </w:r>
+    </w:p>
+    <w:p>
+      <w:pPr>
+        <w:pStyle w:val="NoSpacing"/>
+        <w:rPr>
+          <w:rFonts w:eastAsiaTheme="minorEastAsia"/>
+        </w:rPr>
+      </w:pPr>
+      <w:r>
+        <w:rPr>
+          <w:rFonts w:eastAsiaTheme="minorEastAsia"/>
+        </w:rPr>
+        <w:tab/>
+        <w:t xml:space="preserve">The final paper will attempt to further </w:t>
+      </w:r>
+      <w:r>
+        <w:rPr>
+          <w:rFonts w:eastAsiaTheme="minorEastAsia"/>
+        </w:rPr>
+        <w:t>support</w:t>
+      </w:r>
+      <w:r>
+        <w:rPr>
+          <w:rFonts w:eastAsiaTheme="minorEastAsia"/>
+        </w:rPr>
+        <w:t xml:space="preserve"> this connection with more mathematical detail. </w:t>
+      </w:r>
+      <w:r>
+        <w:rPr>
+          <w:rFonts w:eastAsiaTheme="minorEastAsia"/>
+        </w:rPr>
+        <w:t xml:space="preserve">This will include a deeper investigation into the stochastic calculus used to derive either equation, as well as an evaluation of the structural equivalence of either equation through variable mapping. </w:t>
+      </w:r>
+      <w:r>
+        <w:rPr>
+          <w:rFonts w:eastAsiaTheme="minorEastAsia"/>
+        </w:rPr>
+        <w:t xml:space="preserve">Once this </w:t>
+      </w:r>
+      <w:r>
+        <w:rPr>
+          <w:rFonts w:eastAsiaTheme="minorEastAsia"/>
+        </w:rPr>
+        <w:t>the math has been reinforced</w:t>
+      </w:r>
+      <w:r>
+        <w:rPr>
+          <w:rFonts w:eastAsiaTheme="minorEastAsia"/>
+        </w:rPr>
+        <w:t xml:space="preserve">, the paper will transition into investigating </w:t>
+      </w:r>
+      <w:r>
+        <w:rPr>
+          <w:rFonts w:eastAsiaTheme="minorEastAsia"/>
+        </w:rPr>
+        <w:t>and evaluating the options for solution methods for either transport equation Both Eulerian and Lagrangian solution methods (such as the Monte-Carlo method) will be considered. Finally, the paper will conclude with the importance of such a connection between the two equations. It will seek to investigate how the generational wealth of knowledge on computationally solving PDF equations for fluid dynamic applications can be used to solve problems in the world of finance.</w:t>
+      </w:r>
+    </w:p>
+    <w:bookmarkEnd w:id="0"/>
+    <w:p>
+      <w:pPr>
+        <w:pStyle w:val="NoSpacing"/>
+      </w:pPr>
+    </w:p>
+    <w:p>
+      <w:pPr>
+        <w:pStyle w:val="NoSpacing"/>
+      </w:pPr>
+      <w:r>
+        <w:rPr>
+          <w:highlight w:val="yellow"/>
+        </w:rPr>
+        <w:t xml:space="preserve">The final paper will expand this preliminary connection by developing the mathematical details underlying both the Black–Scholes–Merton equation and the transported PDF equation. It will begin with a deeper examination of the stochastic calculus used to derive each equation, emphasizing how the same underlying SDE structure leads to the backward Kolmogorov equation </w:t>
+      </w:r>
+      <w:r>
+        <w:rPr>
+          <w:highlight w:val="yellow"/>
+        </w:rPr>
+        <w:lastRenderedPageBreak/>
+        <w:t>in finance and the forward Kolmogorov (Fokker–Planck) equation in turbulence modeling. Building on this foundation, the paper will evaluate the structural equivalence of the two formulations through explicit variable mappings and parallel derivations. After establishing this mathematical correspondence, the paper will investigate numerical strategies for solving each transport equation, including both Eulerian and Lagrangian approaches, with particular attention to Monte</w:t>
+      </w:r>
+      <w:r>
+        <w:rPr>
+          <w:highlight w:val="yellow"/>
+        </w:rPr>
+        <w:noBreakHyphen/>
+        <w:t>Carlo–based methods. The paper will conclude by assessing the broader significance of this connection, exploring how decades of development in computational PDF methods for fluid dynamics may inform and potentially improve numerical techniques used in financial option pricing.</w:t>
+      </w:r>
+    </w:p>
+    <w:p>
+      <w:pPr>
+        <w:pStyle w:val="NoSpacing"/>
+      </w:pPr>
+    </w:p>
+    <w:p>
+      <w:pPr>
+        <w:pStyle w:val="NoSpacing"/>
+      </w:pPr>
+    </w:p>
+    <w:p>
+      <w:pPr>
+        <w:pStyle w:val="NoSpacing"/>
+      </w:pPr>
+    </w:p>
+    <w:p>
+      <w:pPr>
+        <w:pStyle w:val="NoSpacing"/>
+      </w:pPr>
+    </w:p>
+    <w:p>
+      <w:pPr>
+        <w:pStyle w:val="NoSpacing"/>
+      </w:pPr>
+    </w:p>
+    <w:p>
+      <w:pPr>
+        <w:pStyle w:val="NoSpacing"/>
+      </w:pPr>
+    </w:p>
+    <w:p>
+      <w:pPr>
+        <w:pStyle w:val="NoSpacing"/>
+      </w:pPr>
+    </w:p>
+    <w:p>
+      <w:pPr>
+        <w:pStyle w:val="NoSpacing"/>
+      </w:pPr>
+    </w:p>
+    <w:p>
+      <w:pPr>
+        <w:pStyle w:val="NoSpacing"/>
+      </w:pPr>
+    </w:p>
+    <w:p>
+      <w:pPr>
+        <w:pStyle w:val="NoSpacing"/>
+      </w:pPr>
+    </w:p>
+    <w:p>
+      <w:pPr>
+        <w:pStyle w:val="NoSpacing"/>
+      </w:pPr>
+    </w:p>
+    <w:p>
+      <w:pPr>
+        <w:pStyle w:val="NoSpacing"/>
+      </w:pPr>
+    </w:p>
+    <w:p>
+      <w:pPr>
+        <w:pStyle w:val="NoSpacing"/>
+      </w:pPr>
+    </w:p>
+    <w:p>
+      <w:pPr>
+        <w:pStyle w:val="NoSpacing"/>
+      </w:pPr>
+    </w:p>
+    <w:p>
+      <w:pPr>
+        <w:pStyle w:val="NoSpacing"/>
+      </w:pPr>
     </w:p>
     <w:p>
       <w:pPr>
@@ -737,7 +2997,15 @@
         <w:t xml:space="preserve"> </w:t>
       </w:r>
       <w:r>
-        <w:t>certain conditions, within a specified period of time. An "American option"</w:t>
+        <w:t xml:space="preserve">certain conditions, within a specified </w:t>
+      </w:r>
+      <w:proofErr w:type="gramStart"/>
+      <w:r>
+        <w:t>period of time</w:t>
+      </w:r>
+      <w:proofErr w:type="gramEnd"/>
+      <w:r>
+        <w:t>. An "American option"</w:t>
       </w:r>
       <w:r>
         <w:t xml:space="preserve"> </w:t>
@@ -767,7 +3035,11 @@
         <w:t xml:space="preserve"> </w:t>
       </w:r>
       <w:r>
-        <w:t>which the option may be exercised is called the "expiration date" or</w:t>
+        <w:t xml:space="preserve">which the option </w:t>
+      </w:r>
+      <w:r>
+        <w:lastRenderedPageBreak/>
+        <w:t>may be exercised is called the "expiration date" or</w:t>
       </w:r>
       <w:r>
         <w:t xml:space="preserve"> </w:t>
@@ -916,8 +3188,13 @@
       <w:r>
         <w:t xml:space="preserve"> </w:t>
       </w:r>
-      <w:r>
-        <w:t>Thus the distribution of possible stock prices at the end of any finite interval is log-normal. The variance rate of the return on the stock is constan</w:t>
+      <w:proofErr w:type="gramStart"/>
+      <w:r>
+        <w:t>Thus</w:t>
+      </w:r>
+      <w:proofErr w:type="gramEnd"/>
+      <w:r>
+        <w:t xml:space="preserve"> the distribution of possible stock prices at the end of any finite interval is log-normal. The variance rate of the return on the stock is constan</w:t>
       </w:r>
       <w:r>
         <w:t>t.</w:t>
@@ -1047,11 +3324,23 @@
         </w:numPr>
       </w:pPr>
       <w:r>
-        <w:t xml:space="preserve">Standard call option: The strong law and expectation give the wrong price for forwards. But in a certain sense, the forward is a special case. The construction strategy buying the </w:t>
-      </w:r>
-      <w:r>
-        <w:lastRenderedPageBreak/>
-        <w:t>stock and holding it - certainly wouldn't work for more complex claims. The standard call option which offers the buyer the right but not the obligation to receive the stock for some strike price agreed in advance certainly couldn't be constructed this way. If the stock price ends up above the strike, then the buyer would exercise the option and ask to receive the stock - having it salted away in a drawer would then be useful to the seller. But if the stock price ends up below the strike, the buyer will abandon the option and any stock owned by the seller would have incurred a pointless loss.</w:t>
+        <w:t xml:space="preserve">Standard call option: The strong law and expectation give the wrong price for forwards. But in a certain sense, the forward is a special case. The construction strategy buying the stock and holding it - certainly </w:t>
+      </w:r>
+      <w:proofErr w:type="gramStart"/>
+      <w:r>
+        <w:t>wouldn't</w:t>
+      </w:r>
+      <w:proofErr w:type="gramEnd"/>
+      <w:r>
+        <w:t xml:space="preserve"> work for more complex claims. The standard call option which offers the buyer the right but not the obligation to receive the stock for some strike price agreed in advance certainly </w:t>
+      </w:r>
+      <w:proofErr w:type="gramStart"/>
+      <w:r>
+        <w:t>couldn't</w:t>
+      </w:r>
+      <w:proofErr w:type="gramEnd"/>
+      <w:r>
+        <w:t xml:space="preserve"> be constructed this way. If the stock price ends up above the strike, then the buyer would exercise the option and ask to receive the stock - having it salted away in a drawer would then be useful to the seller. But if the stock price ends up below the strike, the buyer will abandon the option and any stock owned by the seller would have incurred a pointless loss.</w:t>
       </w:r>
     </w:p>
     <w:p>
@@ -1063,19 +3352,156 @@
         </w:numPr>
       </w:pPr>
       <w:r>
-        <w:t>Consider the seller of the contract, obliged to deliver the stock at time T in exchange for some agreed amount. They could borrow So now, buy the stock with it, put the stock in a drawer and just wait. When the contract expires, they have to pay back the loan - which if the continuously compounded rate is r means paying back So exp(rT) , but they have the stock ready to deliver. If</w:t>
+        <w:t xml:space="preserve">Consider the seller of the contract, obliged to deliver the stock at time T in exchange for some agreed amount. They could borrow So now, buy the stock with it, put the stock in a </w:t>
+      </w:r>
+      <w:proofErr w:type="gramStart"/>
+      <w:r>
+        <w:t>drawer</w:t>
+      </w:r>
+      <w:proofErr w:type="gramEnd"/>
+      <w:r>
+        <w:t xml:space="preserve"> and just wait. When the contract expires, they </w:t>
+      </w:r>
+      <w:proofErr w:type="gramStart"/>
+      <w:r>
+        <w:t>have to</w:t>
+      </w:r>
+      <w:proofErr w:type="gramEnd"/>
+      <w:r>
+        <w:t xml:space="preserve"> pay back the loan - which if the continuously compounded rate is r means paying back So exp(</w:t>
+      </w:r>
+      <w:proofErr w:type="spellStart"/>
+      <w:r>
+        <w:t>rT</w:t>
+      </w:r>
+      <w:proofErr w:type="spellEnd"/>
+      <w:proofErr w:type="gramStart"/>
+      <w:r>
+        <w:t>) ,</w:t>
+      </w:r>
+      <w:proofErr w:type="gramEnd"/>
+      <w:r>
+        <w:t xml:space="preserve"> but they have the stock ready to deliver. If</w:t>
       </w:r>
       <w:r>
         <w:t xml:space="preserve"> </w:t>
       </w:r>
       <w:r>
-        <w:t>they wrote less than So exp(rT) into the contract as the amount for forward payment, then they would lose money with certainty. So the forward price is bounded below by So exp(rT). But of course, the buyer of the contract can run the scheme in reverse, thus writing more than So exp(rT) into the contract would guarantee them a loss. The forward price is bounded above by So exp(rT) as well. Thus there is an enforced price, not of So exp(J.1 + !a2 ) but So exp(rT). Any attempt to strike a different price and offer it into a market would inevitably lead to someone taking advantage of the free money available via the construction procedure. And unlike the coin game, mortgaging the house would now be a rational action. This type of market opportunism is old enough to be ennobled with a name - arbitrage. The price of</w:t>
+        <w:t xml:space="preserve">they wrote less than </w:t>
+      </w:r>
+      <w:proofErr w:type="gramStart"/>
+      <w:r>
+        <w:t>So</w:t>
+      </w:r>
+      <w:proofErr w:type="gramEnd"/>
+      <w:r>
+        <w:t xml:space="preserve"> exp(</w:t>
+      </w:r>
+      <w:proofErr w:type="spellStart"/>
+      <w:r>
+        <w:t>rT</w:t>
+      </w:r>
+      <w:proofErr w:type="spellEnd"/>
+      <w:r>
+        <w:t xml:space="preserve">) into the contract as the amount for forward payment, then they would lose money with certainty. </w:t>
+      </w:r>
+      <w:proofErr w:type="gramStart"/>
+      <w:r>
+        <w:t>So</w:t>
+      </w:r>
+      <w:proofErr w:type="gramEnd"/>
+      <w:r>
+        <w:t xml:space="preserve"> the forward price is bounded below by So exp(</w:t>
+      </w:r>
+      <w:proofErr w:type="spellStart"/>
+      <w:r>
+        <w:t>rT</w:t>
+      </w:r>
+      <w:proofErr w:type="spellEnd"/>
+      <w:r>
+        <w:t xml:space="preserve">). But of course, the buyer of the contract can run the scheme in reverse, thus writing more than </w:t>
+      </w:r>
+      <w:proofErr w:type="gramStart"/>
+      <w:r>
+        <w:t>So</w:t>
+      </w:r>
+      <w:proofErr w:type="gramEnd"/>
+      <w:r>
+        <w:t xml:space="preserve"> exp(</w:t>
+      </w:r>
+      <w:proofErr w:type="spellStart"/>
+      <w:r>
+        <w:t>rT</w:t>
+      </w:r>
+      <w:proofErr w:type="spellEnd"/>
+      <w:r>
+        <w:t xml:space="preserve">) into the contract would guarantee them a </w:t>
+      </w:r>
+      <w:r>
+        <w:lastRenderedPageBreak/>
+        <w:t>loss. The forward price is bounded above by So exp(</w:t>
+      </w:r>
+      <w:proofErr w:type="spellStart"/>
+      <w:r>
+        <w:t>rT</w:t>
+      </w:r>
+      <w:proofErr w:type="spellEnd"/>
+      <w:r>
+        <w:t xml:space="preserve">) as well. </w:t>
+      </w:r>
+      <w:proofErr w:type="gramStart"/>
+      <w:r>
+        <w:t>Thus</w:t>
+      </w:r>
+      <w:proofErr w:type="gramEnd"/>
+      <w:r>
+        <w:t xml:space="preserve"> there is an enforced price, not of So </w:t>
+      </w:r>
+      <w:proofErr w:type="gramStart"/>
+      <w:r>
+        <w:t>exp(</w:t>
+      </w:r>
+      <w:proofErr w:type="gramEnd"/>
+      <w:r>
+        <w:t xml:space="preserve">J.1 </w:t>
+      </w:r>
+      <w:proofErr w:type="gramStart"/>
+      <w:r>
+        <w:t>+ !a2 )</w:t>
+      </w:r>
+      <w:proofErr w:type="gramEnd"/>
+      <w:r>
+        <w:t xml:space="preserve"> but </w:t>
+      </w:r>
+      <w:proofErr w:type="gramStart"/>
+      <w:r>
+        <w:t>So</w:t>
+      </w:r>
+      <w:proofErr w:type="gramEnd"/>
+      <w:r>
+        <w:t xml:space="preserve"> exp(</w:t>
+      </w:r>
+      <w:proofErr w:type="spellStart"/>
+      <w:r>
+        <w:t>rT</w:t>
+      </w:r>
+      <w:proofErr w:type="spellEnd"/>
+      <w:r>
+        <w:t>). Any attempt to strike a different price and offer it into a market would inevitably lead to someone taking advantage of the free money available via the construction procedure. And unlike the coin game, mortgaging the house would now be a rational action. This type of market opportunism is old enough to be ennobled with a name - arbitrage. The price of</w:t>
       </w:r>
       <w:r>
         <w:t xml:space="preserve"> </w:t>
       </w:r>
       <w:r>
-        <w:t>So exp(rT) is an arbitrage price - it is justified because any other price could lead to unlimited riskless profits for one party.</w:t>
+        <w:t>So exp(</w:t>
+      </w:r>
+      <w:proofErr w:type="spellStart"/>
+      <w:r>
+        <w:t>rT</w:t>
+      </w:r>
+      <w:proofErr w:type="spellEnd"/>
+      <w:r>
+        <w:t>) is an arbitrage price - it is justified because any other price could lead to unlimited riskless profits for one party.</w:t>
       </w:r>
     </w:p>
     <w:p>
@@ -1099,7 +3525,15 @@
         <w:t xml:space="preserve"> </w:t>
       </w:r>
       <w:r>
-        <w:t>stock for a strike price k at any time up to and including the expiration date T, rather than only at that date. The buyer of the option then has to make decisions from moment to moment to decide when and if to call the option.</w:t>
+        <w:t xml:space="preserve">stock for a strike price k at any time up to and including the expiration date T, rather than only at that date. The buyer of the option then </w:t>
+      </w:r>
+      <w:proofErr w:type="gramStart"/>
+      <w:r>
+        <w:t>has to</w:t>
+      </w:r>
+      <w:proofErr w:type="gramEnd"/>
+      <w:r>
+        <w:t xml:space="preserve"> make decisions from moment to moment to decide when and if to call the option.</w:t>
       </w:r>
     </w:p>
     <w:p>
@@ -1170,321 +3604,380 @@
       <w:r>
         <w:t xml:space="preserve">call </w:t>
       </w:r>
+      <w:proofErr w:type="spellStart"/>
+      <w:proofErr w:type="gramStart"/>
       <w:r>
         <w:rPr>
           <w:i/>
           <w:iCs/>
         </w:rPr>
-        <w:t xml:space="preserve">dWt . </w:t>
-      </w:r>
-      <w:r>
-        <w:t xml:space="preserve">The Brownian term of </w:t>
-      </w:r>
+        <w:t>dWt</w:t>
+      </w:r>
+      <w:proofErr w:type="spellEnd"/>
       <w:r>
         <w:rPr>
           <w:i/>
           <w:iCs/>
         </w:rPr>
-        <w:t xml:space="preserve">X </w:t>
-      </w:r>
-      <w:r>
-        <w:t xml:space="preserve">can have a noise factor </w:t>
-      </w:r>
+        <w:t xml:space="preserve"> .</w:t>
+      </w:r>
+      <w:proofErr w:type="gramEnd"/>
       <w:r>
         <w:rPr>
           <w:i/>
           <w:iCs/>
         </w:rPr>
-        <w:t xml:space="preserve">at, </w:t>
-      </w:r>
-      <w:r>
-        <w:t>and so the</w:t>
-      </w:r>
-      <w:r>
         <w:t xml:space="preserve"> </w:t>
       </w:r>
       <w:r>
-        <w:t xml:space="preserve">infinitesimal change of </w:t>
+        <w:t xml:space="preserve">The Brownian term of </w:t>
       </w:r>
       <w:r>
         <w:rPr>
           <w:i/>
           <w:iCs/>
         </w:rPr>
-        <w:t xml:space="preserve">X t </w:t>
-      </w:r>
-      <w:r>
-        <w:t>is</w:t>
-      </w:r>
-      <w:r>
-        <w:t xml:space="preserve"> </w:t>
+        <w:t xml:space="preserve">X </w:t>
+      </w:r>
+      <w:r>
+        <w:t xml:space="preserve">can have a noise factor </w:t>
       </w:r>
       <w:r>
         <w:rPr>
           <w:i/>
           <w:iCs/>
         </w:rPr>
-        <w:t xml:space="preserve">dXt </w:t>
-      </w:r>
-      <w:r>
-        <w:t xml:space="preserve">= </w:t>
+        <w:t xml:space="preserve">at, </w:t>
+      </w:r>
+      <w:r>
+        <w:t>and so the</w:t>
+      </w:r>
+      <w:r>
+        <w:t xml:space="preserve"> </w:t>
+      </w:r>
+      <w:r>
+        <w:t xml:space="preserve">infinitesimal change of </w:t>
       </w:r>
       <w:r>
         <w:rPr>
           <w:i/>
           <w:iCs/>
         </w:rPr>
-        <w:t xml:space="preserve">at dWt </w:t>
-      </w:r>
-      <w:r>
-        <w:t xml:space="preserve">+ </w:t>
-      </w:r>
+        <w:t xml:space="preserve">X t </w:t>
+      </w:r>
+      <w:r>
+        <w:t>is</w:t>
+      </w:r>
+      <w:r>
+        <w:t xml:space="preserve"> </w:t>
+      </w:r>
+      <w:proofErr w:type="spellStart"/>
       <w:r>
         <w:rPr>
           <w:i/>
           <w:iCs/>
         </w:rPr>
-        <w:t>J1t dt.</w:t>
-      </w:r>
-      <w:r>
-        <w:t xml:space="preserve"> </w:t>
-      </w:r>
-      <w:r>
-        <w:t xml:space="preserve">As in the Newtonian case, the drift </w:t>
-      </w:r>
+        <w:t>dXt</w:t>
+      </w:r>
+      <w:proofErr w:type="spellEnd"/>
       <w:r>
         <w:rPr>
           <w:i/>
           <w:iCs/>
         </w:rPr>
-        <w:t xml:space="preserve">Mt </w:t>
-      </w:r>
-      <w:r>
-        <w:t xml:space="preserve">can depend on the time </w:t>
+        <w:t xml:space="preserve"> </w:t>
+      </w:r>
+      <w:r>
+        <w:t xml:space="preserve">= </w:t>
       </w:r>
       <w:r>
         <w:rPr>
           <w:i/>
           <w:iCs/>
         </w:rPr>
-        <w:t xml:space="preserve">t. </w:t>
-      </w:r>
-      <w:r>
-        <w:t>But it can</w:t>
-      </w:r>
-      <w:r>
-        <w:t xml:space="preserve"> </w:t>
-      </w:r>
-      <w:r>
-        <w:t xml:space="preserve">also be random and depend on values that </w:t>
-      </w:r>
+        <w:t xml:space="preserve">at </w:t>
+      </w:r>
+      <w:proofErr w:type="spellStart"/>
       <w:r>
         <w:rPr>
           <w:i/>
           <w:iCs/>
         </w:rPr>
-        <w:t xml:space="preserve">X </w:t>
-      </w:r>
-      <w:r>
-        <w:t xml:space="preserve">(or indeed </w:t>
-      </w:r>
+        <w:t>dWt</w:t>
+      </w:r>
+      <w:proofErr w:type="spellEnd"/>
       <w:r>
         <w:rPr>
           <w:i/>
           <w:iCs/>
         </w:rPr>
-        <w:t xml:space="preserve">W) </w:t>
-      </w:r>
-      <w:r>
-        <w:t xml:space="preserve">took up until </w:t>
+        <w:t xml:space="preserve"> </w:t>
+      </w:r>
+      <w:r>
+        <w:t xml:space="preserve">+ </w:t>
       </w:r>
       <w:r>
         <w:rPr>
           <w:i/>
           <w:iCs/>
         </w:rPr>
-        <w:t>t</w:t>
+        <w:t>J1t dt.</w:t>
       </w:r>
       <w:r>
         <w:t xml:space="preserve"> </w:t>
       </w:r>
       <w:r>
-        <w:t xml:space="preserve">itself. And of course, so can the noisiness </w:t>
+        <w:t xml:space="preserve">As in the Newtonian case, the drift </w:t>
       </w:r>
       <w:r>
         <w:rPr>
           <w:i/>
           <w:iCs/>
         </w:rPr>
-        <w:t xml:space="preserve">at. </w:t>
-      </w:r>
-      <w:r>
-        <w:t xml:space="preserve">Such processes, like </w:t>
+        <w:t xml:space="preserve">Mt </w:t>
+      </w:r>
+      <w:r>
+        <w:t xml:space="preserve">can depend on the time </w:t>
       </w:r>
       <w:r>
         <w:rPr>
           <w:i/>
           <w:iCs/>
         </w:rPr>
-        <w:t xml:space="preserve">X </w:t>
-      </w:r>
-      <w:r>
-        <w:t xml:space="preserve">and </w:t>
+        <w:t xml:space="preserve">t. </w:t>
+      </w:r>
+      <w:r>
+        <w:t>But it can</w:t>
+      </w:r>
+      <w:r>
+        <w:t xml:space="preserve"> </w:t>
+      </w:r>
+      <w:r>
+        <w:t xml:space="preserve">also be random and depend on values that </w:t>
       </w:r>
       <w:r>
         <w:rPr>
           <w:i/>
           <w:iCs/>
         </w:rPr>
-        <w:t>a,</w:t>
-      </w:r>
-      <w:r>
-        <w:t xml:space="preserve"> </w:t>
-      </w:r>
-      <w:r>
-        <w:t xml:space="preserve">whose value at time </w:t>
+        <w:t xml:space="preserve">X </w:t>
+      </w:r>
+      <w:r>
+        <w:t xml:space="preserve">(or indeed </w:t>
       </w:r>
       <w:r>
         <w:rPr>
           <w:i/>
           <w:iCs/>
         </w:rPr>
-        <w:t xml:space="preserve">t </w:t>
-      </w:r>
-      <w:r>
-        <w:t xml:space="preserve">can depend on the history </w:t>
+        <w:t xml:space="preserve">W) </w:t>
+      </w:r>
+      <w:r>
+        <w:t xml:space="preserve">took up until </w:t>
       </w:r>
       <w:r>
         <w:rPr>
           <w:i/>
           <w:iCs/>
         </w:rPr>
-        <w:t xml:space="preserve">Ft , </w:t>
-      </w:r>
-      <w:r>
-        <w:t>but not the future, are</w:t>
+        <w:t>t</w:t>
       </w:r>
       <w:r>
         <w:t xml:space="preserve"> </w:t>
       </w:r>
       <w:r>
-        <w:t xml:space="preserve">called </w:t>
+        <w:t xml:space="preserve">itself. And of course, so can the noisiness </w:t>
       </w:r>
       <w:r>
         <w:rPr>
           <w:i/>
           <w:iCs/>
         </w:rPr>
-        <w:t xml:space="preserve">adapted </w:t>
-      </w:r>
-      <w:r>
-        <w:t xml:space="preserve">to the filtration </w:t>
+        <w:t xml:space="preserve">at. </w:t>
+      </w:r>
+      <w:r>
+        <w:t xml:space="preserve">Such processes, like </w:t>
       </w:r>
       <w:r>
         <w:rPr>
           <w:i/>
           <w:iCs/>
         </w:rPr>
-        <w:t xml:space="preserve">F </w:t>
-      </w:r>
-      <w:r>
-        <w:t xml:space="preserve">of the Brownian motion </w:t>
+        <w:t xml:space="preserve">X </w:t>
+      </w:r>
+      <w:r>
+        <w:t xml:space="preserve">and </w:t>
       </w:r>
       <w:r>
         <w:rPr>
           <w:i/>
           <w:iCs/>
         </w:rPr>
-        <w:t>W.</w:t>
+        <w:t>a,</w:t>
       </w:r>
       <w:r>
         <w:t xml:space="preserve"> </w:t>
       </w:r>
       <w:r>
-        <w:t xml:space="preserve">We call </w:t>
+        <w:t xml:space="preserve">whose value at time </w:t>
       </w:r>
       <w:r>
         <w:rPr>
           <w:i/>
           <w:iCs/>
         </w:rPr>
-        <w:t xml:space="preserve">at </w:t>
-      </w:r>
-      <w:r>
-        <w:t xml:space="preserve">the </w:t>
-      </w:r>
+        <w:t xml:space="preserve">t </w:t>
+      </w:r>
+      <w:r>
+        <w:t xml:space="preserve">can depend on the history </w:t>
+      </w:r>
+      <w:proofErr w:type="gramStart"/>
       <w:r>
         <w:rPr>
           <w:i/>
           <w:iCs/>
         </w:rPr>
-        <w:t xml:space="preserve">volatility </w:t>
-      </w:r>
-      <w:r>
-        <w:t>of</w:t>
-      </w:r>
-      <w:r>
-        <w:t xml:space="preserve"> </w:t>
-      </w:r>
-      <w:r>
-        <w:t xml:space="preserve">the process </w:t>
-      </w:r>
+        <w:t>Ft ,</w:t>
+      </w:r>
+      <w:proofErr w:type="gramEnd"/>
       <w:r>
         <w:rPr>
           <w:i/>
           <w:iCs/>
         </w:rPr>
-        <w:t xml:space="preserve">X </w:t>
-      </w:r>
-      <w:r>
-        <w:t xml:space="preserve">at time </w:t>
+        <w:t xml:space="preserve"> </w:t>
+      </w:r>
+      <w:r>
+        <w:t>but not the future, are</w:t>
+      </w:r>
+      <w:r>
+        <w:t xml:space="preserve"> </w:t>
+      </w:r>
+      <w:r>
+        <w:t xml:space="preserve">called </w:t>
       </w:r>
       <w:r>
         <w:rPr>
           <w:i/>
           <w:iCs/>
         </w:rPr>
-        <w:t xml:space="preserve">t </w:t>
-      </w:r>
-      <w:r>
-        <w:t xml:space="preserve">and </w:t>
+        <w:t xml:space="preserve">adapted </w:t>
+      </w:r>
+      <w:r>
+        <w:t xml:space="preserve">to the filtration </w:t>
       </w:r>
       <w:r>
         <w:rPr>
           <w:i/>
           <w:iCs/>
         </w:rPr>
-        <w:t xml:space="preserve">Mt </w:t>
-      </w:r>
-      <w:r>
-        <w:t xml:space="preserve">the </w:t>
+        <w:t xml:space="preserve">F </w:t>
+      </w:r>
+      <w:r>
+        <w:t xml:space="preserve">of the Brownian motion </w:t>
       </w:r>
       <w:r>
         <w:rPr>
           <w:i/>
           <w:iCs/>
         </w:rPr>
-        <w:t xml:space="preserve">drift </w:t>
-      </w:r>
-      <w:r>
-        <w:t xml:space="preserve">of </w:t>
+        <w:t>W.</w:t>
+      </w:r>
+      <w:r>
+        <w:t xml:space="preserve"> </w:t>
+      </w:r>
+      <w:r>
+        <w:t xml:space="preserve">We call </w:t>
       </w:r>
       <w:r>
         <w:rPr>
           <w:i/>
           <w:iCs/>
         </w:rPr>
-        <w:t xml:space="preserve">X </w:t>
-      </w:r>
-      <w:r>
         <w:t xml:space="preserve">at </w:t>
+      </w:r>
+      <w:r>
+        <w:t xml:space="preserve">the </w:t>
       </w:r>
       <w:r>
         <w:rPr>
           <w:i/>
           <w:iCs/>
         </w:rPr>
+        <w:t xml:space="preserve">volatility </w:t>
+      </w:r>
+      <w:r>
+        <w:t>of</w:t>
+      </w:r>
+      <w:r>
+        <w:t xml:space="preserve"> </w:t>
+      </w:r>
+      <w:r>
+        <w:t xml:space="preserve">the process </w:t>
+      </w:r>
+      <w:r>
+        <w:rPr>
+          <w:i/>
+          <w:iCs/>
+        </w:rPr>
+        <w:t xml:space="preserve">X </w:t>
+      </w:r>
+      <w:r>
+        <w:t xml:space="preserve">at time </w:t>
+      </w:r>
+      <w:r>
+        <w:rPr>
+          <w:i/>
+          <w:iCs/>
+        </w:rPr>
+        <w:t xml:space="preserve">t </w:t>
+      </w:r>
+      <w:r>
+        <w:t xml:space="preserve">and </w:t>
+      </w:r>
+      <w:r>
+        <w:rPr>
+          <w:i/>
+          <w:iCs/>
+        </w:rPr>
+        <w:t xml:space="preserve">Mt </w:t>
+      </w:r>
+      <w:r>
+        <w:t xml:space="preserve">the </w:t>
+      </w:r>
+      <w:r>
+        <w:rPr>
+          <w:i/>
+          <w:iCs/>
+        </w:rPr>
+        <w:t xml:space="preserve">drift </w:t>
+      </w:r>
+      <w:r>
+        <w:t xml:space="preserve">of </w:t>
+      </w:r>
+      <w:r>
+        <w:rPr>
+          <w:i/>
+          <w:iCs/>
+        </w:rPr>
+        <w:t xml:space="preserve">X </w:t>
+      </w:r>
+      <w:r>
+        <w:t xml:space="preserve">at </w:t>
+      </w:r>
+      <w:r>
+        <w:rPr>
+          <w:i/>
+          <w:iCs/>
+        </w:rPr>
         <w:t>t.</w:t>
+      </w:r>
+      <w:r>
+        <w:rPr>
+          <w:i/>
+          <w:iCs/>
+        </w:rPr>
+        <w:t xml:space="preserve"> (55)</w:t>
       </w:r>
     </w:p>
     <w:p>
@@ -1541,11 +4034,357 @@
         <w:pStyle w:val="NoSpacing"/>
       </w:pPr>
       <w:r>
+        <w:t>[5] Shreve</w:t>
+      </w:r>
+    </w:p>
+    <w:p>
+      <w:pPr>
+        <w:pStyle w:val="NoSpacing"/>
+        <w:numPr>
+          <w:ilvl w:val="0"/>
+          <w:numId w:val="10"/>
+        </w:numPr>
+      </w:pPr>
+      <w:r>
+        <w:t>A stochastic differential equation is an equation of the form</w:t>
+      </w:r>
+      <w:r>
+        <w:t xml:space="preserve"> </w:t>
+      </w:r>
+      <w:proofErr w:type="spellStart"/>
+      <w:r>
+        <w:t>dX</w:t>
+      </w:r>
+      <w:proofErr w:type="spellEnd"/>
+      <w:r>
+        <w:t>(u) = f3(u, X(u)) du + -</w:t>
+      </w:r>
+      <w:proofErr w:type="gramStart"/>
+      <w:r>
+        <w:t>y(</w:t>
+      </w:r>
+      <w:proofErr w:type="gramEnd"/>
+      <w:r>
+        <w:t xml:space="preserve">u, X(u)) </w:t>
+      </w:r>
+      <w:proofErr w:type="spellStart"/>
+      <w:r>
+        <w:t>dW</w:t>
+      </w:r>
+      <w:proofErr w:type="spellEnd"/>
+      <w:r>
+        <w:t>(u). (6.2. 1)</w:t>
+      </w:r>
+      <w:r>
+        <w:t xml:space="preserve"> </w:t>
+      </w:r>
+      <w:r>
+        <w:t>Here /</w:t>
+      </w:r>
+      <w:proofErr w:type="gramStart"/>
+      <w:r>
+        <w:t>3( u</w:t>
+      </w:r>
+      <w:proofErr w:type="gramEnd"/>
+      <w:r>
+        <w:t>, x) and -</w:t>
+      </w:r>
+      <w:proofErr w:type="gramStart"/>
+      <w:r>
+        <w:t>y( u</w:t>
+      </w:r>
+      <w:proofErr w:type="gramEnd"/>
+      <w:r>
+        <w:t>, x) are given functions, called the drift and diffusion,</w:t>
+      </w:r>
+      <w:r>
+        <w:t xml:space="preserve"> </w:t>
+      </w:r>
+      <w:r>
+        <w:t>respectively. In addition to this equation, an initial condition of the form</w:t>
+      </w:r>
+      <w:r>
+        <w:t xml:space="preserve"> </w:t>
+      </w:r>
+      <w:r>
+        <w:t xml:space="preserve">X </w:t>
+      </w:r>
+      <w:proofErr w:type="gramStart"/>
+      <w:r>
+        <w:t>( t</w:t>
+      </w:r>
+      <w:proofErr w:type="gramEnd"/>
+      <w:r>
+        <w:t xml:space="preserve">) = </w:t>
+      </w:r>
+      <w:proofErr w:type="gramStart"/>
+      <w:r>
+        <w:t>x ,</w:t>
+      </w:r>
+      <w:proofErr w:type="gramEnd"/>
+      <w:r>
+        <w:t xml:space="preserve"> where t </w:t>
+      </w:r>
+      <w:proofErr w:type="gramStart"/>
+      <w:r>
+        <w:t>2::</w:t>
+      </w:r>
+      <w:proofErr w:type="gramEnd"/>
+      <w:r>
+        <w:t xml:space="preserve"> 0 and x E IR, is </w:t>
+      </w:r>
+      <w:proofErr w:type="gramStart"/>
+      <w:r>
+        <w:t>specified.</w:t>
+      </w:r>
+      <w:r>
+        <w:t>(</w:t>
+      </w:r>
+      <w:proofErr w:type="gramEnd"/>
+      <w:r>
+        <w:t>263)</w:t>
+      </w:r>
+    </w:p>
+    <w:p>
+      <w:pPr>
+        <w:pStyle w:val="NoSpacing"/>
+        <w:numPr>
+          <w:ilvl w:val="0"/>
+          <w:numId w:val="10"/>
+        </w:numPr>
+      </w:pPr>
+      <w:r>
+        <w:t>Feynman-Kac</w:t>
+      </w:r>
+      <w:r>
+        <w:t xml:space="preserve"> </w:t>
+      </w:r>
+      <w:r>
+        <w:t>–</w:t>
+      </w:r>
+      <w:r>
+        <w:t xml:space="preserve"> 268</w:t>
+      </w:r>
+    </w:p>
+    <w:p>
+      <w:pPr>
+        <w:pStyle w:val="NoSpacing"/>
+        <w:numPr>
+          <w:ilvl w:val="0"/>
+          <w:numId w:val="10"/>
+        </w:numPr>
+      </w:pPr>
+      <w:r>
+        <w:t>SDE for BS and Derivation o BS (153-158)</w:t>
+      </w:r>
+    </w:p>
+    <w:p>
+      <w:pPr>
+        <w:pStyle w:val="NoSpacing"/>
+        <w:ind w:left="720"/>
+      </w:pPr>
+    </w:p>
+    <w:p>
+      <w:pPr>
+        <w:pStyle w:val="NoSpacing"/>
+        <w:ind w:left="720"/>
+      </w:pPr>
+    </w:p>
+    <w:p>
+      <w:pPr>
+        <w:pStyle w:val="NoSpacing"/>
+        <w:ind w:left="720"/>
+      </w:pPr>
+    </w:p>
+    <w:p>
+      <w:pPr>
+        <w:pStyle w:val="NoSpacing"/>
+        <w:numPr>
+          <w:ilvl w:val="0"/>
+          <w:numId w:val="10"/>
+        </w:numPr>
+      </w:pPr>
+      <w:r>
         <w:t>Fokker–Planck for</w:t>
       </w:r>
       <w:r>
         <w:t>m?</w:t>
       </w:r>
+    </w:p>
+    <w:p>
+      <w:pPr>
+        <w:pStyle w:val="NoSpacing"/>
+      </w:pPr>
+    </w:p>
+    <w:p>
+      <w:pPr>
+        <w:pStyle w:val="NoSpacing"/>
+      </w:pPr>
+    </w:p>
+    <w:p>
+      <w:pPr>
+        <w:pStyle w:val="NoSpacing"/>
+      </w:pPr>
+    </w:p>
+    <w:p>
+      <w:pPr>
+        <w:pStyle w:val="NoSpacing"/>
+      </w:pPr>
+    </w:p>
+    <w:p>
+      <w:pPr>
+        <w:pStyle w:val="NoSpacing"/>
+      </w:pPr>
+    </w:p>
+    <w:p>
+      <w:pPr>
+        <w:pStyle w:val="NoSpacing"/>
+      </w:pPr>
+    </w:p>
+    <w:p>
+      <w:pPr>
+        <w:pStyle w:val="NoSpacing"/>
+      </w:pPr>
+    </w:p>
+    <w:p>
+      <w:pPr>
+        <w:pStyle w:val="NoSpacing"/>
+      </w:pPr>
+    </w:p>
+    <w:p>
+      <w:pPr>
+        <w:pStyle w:val="NoSpacing"/>
+      </w:pPr>
+    </w:p>
+    <w:p>
+      <w:pPr>
+        <w:pStyle w:val="NoSpacing"/>
+      </w:pPr>
+    </w:p>
+    <w:p>
+      <w:pPr>
+        <w:pStyle w:val="NoSpacing"/>
+      </w:pPr>
+    </w:p>
+    <w:p>
+      <w:pPr>
+        <w:pStyle w:val="NoSpacing"/>
+      </w:pPr>
+    </w:p>
+    <w:p>
+      <w:pPr>
+        <w:pStyle w:val="NoSpacing"/>
+      </w:pPr>
+    </w:p>
+    <w:p>
+      <w:pPr>
+        <w:pStyle w:val="NoSpacing"/>
+      </w:pPr>
+    </w:p>
+    <w:p>
+      <w:pPr>
+        <w:pStyle w:val="NoSpacing"/>
+      </w:pPr>
+    </w:p>
+    <w:p>
+      <w:pPr>
+        <w:pStyle w:val="NoSpacing"/>
+      </w:pPr>
+    </w:p>
+    <w:p>
+      <w:pPr>
+        <w:pStyle w:val="NoSpacing"/>
+      </w:pPr>
+    </w:p>
+    <w:p>
+      <w:pPr>
+        <w:pStyle w:val="NoSpacing"/>
+      </w:pPr>
+    </w:p>
+    <w:p>
+      <w:pPr>
+        <w:pStyle w:val="NoSpacing"/>
+      </w:pPr>
+    </w:p>
+    <w:p>
+      <w:pPr>
+        <w:pStyle w:val="NoSpacing"/>
+      </w:pPr>
+    </w:p>
+    <w:p>
+      <w:pPr>
+        <w:pStyle w:val="NoSpacing"/>
+      </w:pPr>
+    </w:p>
+    <w:p>
+      <w:pPr>
+        <w:pStyle w:val="NoSpacing"/>
+      </w:pPr>
+    </w:p>
+    <w:p>
+      <w:pPr>
+        <w:pStyle w:val="NoSpacing"/>
+      </w:pPr>
+    </w:p>
+    <w:p>
+      <w:pPr>
+        <w:pStyle w:val="NoSpacing"/>
+      </w:pPr>
+    </w:p>
+    <w:p>
+      <w:pPr>
+        <w:pStyle w:val="NoSpacing"/>
+      </w:pPr>
+    </w:p>
+    <w:p>
+      <w:pPr>
+        <w:pStyle w:val="NoSpacing"/>
+      </w:pPr>
+    </w:p>
+    <w:p>
+      <w:pPr>
+        <w:pStyle w:val="NoSpacing"/>
+      </w:pPr>
+    </w:p>
+    <w:p>
+      <w:pPr>
+        <w:pStyle w:val="NoSpacing"/>
+      </w:pPr>
+    </w:p>
+    <w:p>
+      <w:pPr>
+        <w:pStyle w:val="NoSpacing"/>
+      </w:pPr>
+    </w:p>
+    <w:p>
+      <w:pPr>
+        <w:pStyle w:val="NoSpacing"/>
+      </w:pPr>
+    </w:p>
+    <w:p>
+      <w:pPr>
+        <w:pStyle w:val="NoSpacing"/>
+      </w:pPr>
+    </w:p>
+    <w:p>
+      <w:pPr>
+        <w:pStyle w:val="NoSpacing"/>
+      </w:pPr>
+    </w:p>
+    <w:p>
+      <w:pPr>
+        <w:pStyle w:val="NoSpacing"/>
+      </w:pPr>
+    </w:p>
+    <w:p>
+      <w:pPr>
+        <w:pStyle w:val="NoSpacing"/>
+      </w:pPr>
+    </w:p>
+    <w:p>
+      <w:pPr>
+        <w:pStyle w:val="NoSpacing"/>
+      </w:pPr>
     </w:p>
     <w:sectPr>
       <w:pgSz w:w="12240" w:h="15840"/>
@@ -2283,6 +5122,118 @@
     </w:lvl>
   </w:abstractNum>
   <w:abstractNum w:abstractNumId="7" w15:restartNumberingAfterBreak="0">
+    <w:nsid w:val="451611FE"/>
+    <w:multiLevelType w:val="hybridMultilevel"/>
+    <w:tmpl w:val="460251F2"/>
+    <w:lvl w:ilvl="0" w:tplc="895E4328">
+      <w:numFmt w:val="bullet"/>
+      <w:lvlText w:val="-"/>
+      <w:lvlJc w:val="left"/>
+      <w:pPr>
+        <w:ind w:left="720" w:hanging="360"/>
+      </w:pPr>
+      <w:rPr>
+        <w:rFonts w:ascii="Times New Roman" w:eastAsiaTheme="minorHAnsi" w:hAnsi="Times New Roman" w:cs="Times New Roman" w:hint="default"/>
+      </w:rPr>
+    </w:lvl>
+    <w:lvl w:ilvl="1" w:tplc="04090003" w:tentative="1">
+      <w:start w:val="1"/>
+      <w:numFmt w:val="bullet"/>
+      <w:lvlText w:val="o"/>
+      <w:lvlJc w:val="left"/>
+      <w:pPr>
+        <w:ind w:left="1440" w:hanging="360"/>
+      </w:pPr>
+      <w:rPr>
+        <w:rFonts w:ascii="Courier New" w:hAnsi="Courier New" w:cs="Courier New" w:hint="default"/>
+      </w:rPr>
+    </w:lvl>
+    <w:lvl w:ilvl="2" w:tplc="04090005" w:tentative="1">
+      <w:start w:val="1"/>
+      <w:numFmt w:val="bullet"/>
+      <w:lvlText w:val=""/>
+      <w:lvlJc w:val="left"/>
+      <w:pPr>
+        <w:ind w:left="2160" w:hanging="360"/>
+      </w:pPr>
+      <w:rPr>
+        <w:rFonts w:ascii="Wingdings" w:hAnsi="Wingdings" w:hint="default"/>
+      </w:rPr>
+    </w:lvl>
+    <w:lvl w:ilvl="3" w:tplc="04090001" w:tentative="1">
+      <w:start w:val="1"/>
+      <w:numFmt w:val="bullet"/>
+      <w:lvlText w:val=""/>
+      <w:lvlJc w:val="left"/>
+      <w:pPr>
+        <w:ind w:left="2880" w:hanging="360"/>
+      </w:pPr>
+      <w:rPr>
+        <w:rFonts w:ascii="Symbol" w:hAnsi="Symbol" w:hint="default"/>
+      </w:rPr>
+    </w:lvl>
+    <w:lvl w:ilvl="4" w:tplc="04090003" w:tentative="1">
+      <w:start w:val="1"/>
+      <w:numFmt w:val="bullet"/>
+      <w:lvlText w:val="o"/>
+      <w:lvlJc w:val="left"/>
+      <w:pPr>
+        <w:ind w:left="3600" w:hanging="360"/>
+      </w:pPr>
+      <w:rPr>
+        <w:rFonts w:ascii="Courier New" w:hAnsi="Courier New" w:cs="Courier New" w:hint="default"/>
+      </w:rPr>
+    </w:lvl>
+    <w:lvl w:ilvl="5" w:tplc="04090005" w:tentative="1">
+      <w:start w:val="1"/>
+      <w:numFmt w:val="bullet"/>
+      <w:lvlText w:val=""/>
+      <w:lvlJc w:val="left"/>
+      <w:pPr>
+        <w:ind w:left="4320" w:hanging="360"/>
+      </w:pPr>
+      <w:rPr>
+        <w:rFonts w:ascii="Wingdings" w:hAnsi="Wingdings" w:hint="default"/>
+      </w:rPr>
+    </w:lvl>
+    <w:lvl w:ilvl="6" w:tplc="04090001" w:tentative="1">
+      <w:start w:val="1"/>
+      <w:numFmt w:val="bullet"/>
+      <w:lvlText w:val=""/>
+      <w:lvlJc w:val="left"/>
+      <w:pPr>
+        <w:ind w:left="5040" w:hanging="360"/>
+      </w:pPr>
+      <w:rPr>
+        <w:rFonts w:ascii="Symbol" w:hAnsi="Symbol" w:hint="default"/>
+      </w:rPr>
+    </w:lvl>
+    <w:lvl w:ilvl="7" w:tplc="04090003" w:tentative="1">
+      <w:start w:val="1"/>
+      <w:numFmt w:val="bullet"/>
+      <w:lvlText w:val="o"/>
+      <w:lvlJc w:val="left"/>
+      <w:pPr>
+        <w:ind w:left="5760" w:hanging="360"/>
+      </w:pPr>
+      <w:rPr>
+        <w:rFonts w:ascii="Courier New" w:hAnsi="Courier New" w:cs="Courier New" w:hint="default"/>
+      </w:rPr>
+    </w:lvl>
+    <w:lvl w:ilvl="8" w:tplc="04090005" w:tentative="1">
+      <w:start w:val="1"/>
+      <w:numFmt w:val="bullet"/>
+      <w:lvlText w:val=""/>
+      <w:lvlJc w:val="left"/>
+      <w:pPr>
+        <w:ind w:left="6480" w:hanging="360"/>
+      </w:pPr>
+      <w:rPr>
+        <w:rFonts w:ascii="Wingdings" w:hAnsi="Wingdings" w:hint="default"/>
+      </w:rPr>
+    </w:lvl>
+  </w:abstractNum>
+  <w:abstractNum w:abstractNumId="8" w15:restartNumberingAfterBreak="0">
     <w:nsid w:val="56401340"/>
     <w:multiLevelType w:val="hybridMultilevel"/>
     <w:tmpl w:val="C4BA8E28"/>
@@ -2394,7 +5345,7 @@
       </w:rPr>
     </w:lvl>
   </w:abstractNum>
-  <w:abstractNum w:abstractNumId="8" w15:restartNumberingAfterBreak="0">
+  <w:abstractNum w:abstractNumId="9" w15:restartNumberingAfterBreak="0">
     <w:nsid w:val="79A50076"/>
     <w:multiLevelType w:val="hybridMultilevel"/>
     <w:tmpl w:val="DC4E2ED2"/>
@@ -2484,7 +5435,7 @@
     <w:abstractNumId w:val="3"/>
   </w:num>
   <w:num w:numId="2" w16cid:durableId="1062603858">
-    <w:abstractNumId w:val="7"/>
+    <w:abstractNumId w:val="8"/>
   </w:num>
   <w:num w:numId="3" w16cid:durableId="1511220687">
     <w:abstractNumId w:val="6"/>
@@ -2496,7 +5447,7 @@
     <w:abstractNumId w:val="4"/>
   </w:num>
   <w:num w:numId="6" w16cid:durableId="1711373536">
-    <w:abstractNumId w:val="8"/>
+    <w:abstractNumId w:val="9"/>
   </w:num>
   <w:num w:numId="7" w16cid:durableId="228081898">
     <w:abstractNumId w:val="2"/>
@@ -2506,6 +5457,9 @@
   </w:num>
   <w:num w:numId="9" w16cid:durableId="1179738419">
     <w:abstractNumId w:val="5"/>
+  </w:num>
+  <w:num w:numId="10" w16cid:durableId="935092111">
+    <w:abstractNumId w:val="7"/>
   </w:num>
 </w:numbering>
 </file>

</xml_diff>